<commit_message>
feat: redesign Xianzhi music practice platform
Implement local-first library, practice tools and records, modular APIs, moderation lifecycle, resilient workers, migrations, deployment configuration and automated tests.
</commit_message>
<xml_diff>
--- a/docs/AI乐理学习产品PRD.docx
+++ b/docs/AI乐理学习产品PRD.docx
@@ -39,7 +39,7 @@
         <w:rPr>
           <w:rFonts w:ascii="Microsoft YaHei" w:hAnsi="Microsoft YaHei" w:eastAsia="微软雅黑"/>
         </w:rPr>
-        <w:t>文档版本  V2.1</w:t>
+        <w:t>文档版本  V2.2</w:t>
       </w:r>
     </w:p>
     <w:p>
@@ -75,7 +75,7 @@
         <w:rPr>
           <w:rFonts w:ascii="Microsoft YaHei" w:hAnsi="Microsoft YaHei" w:eastAsia="微软雅黑"/>
         </w:rPr>
-        <w:t>更新日期  2026年9月19日</w:t>
+        <w:t>更新日期  2026年9月20日</w:t>
       </w:r>
     </w:p>
     <w:p>
@@ -116,7 +116,7 @@
         <w:rPr>
           <w:rFonts w:ascii="Microsoft YaHei" w:hAnsi="Microsoft YaHei" w:eastAsia="微软雅黑"/>
         </w:rPr>
-        <w:t>本版本描述产品完整形态，并将功能按依赖关系安排交付阶段。阶段划分只决定实施顺序，不缩减完整产品范围。</w:t>
+        <w:t>本版本保留产品完整形态，并按内容覆盖、算法成熟度和平台能力安排交付阶段。四种乐器均建设入门课程；实时 AI 评分按乐器、练习类型和内部设备能力逐项验证、灰度开放。阶段划分决定实施顺序和能力开放范围，不缩减长期产品愿景。</w:t>
       </w:r>
     </w:p>
     <w:tbl>
@@ -141,6 +141,7 @@
       <w:tr>
         <w:trPr>
           <w:tblHeader w:val="true"/>
+          <w:cantSplit/>
         </w:trPr>
         <w:tc>
           <w:tcPr>
@@ -198,6 +199,9 @@
         </w:tc>
       </w:tr>
       <w:tr>
+        <w:trPr>
+          <w:cantSplit/>
+        </w:trPr>
         <w:tc>
           <w:tcPr>
             <w:tcW w:type="dxa" w:w="1814"/>
@@ -249,6 +253,9 @@
         </w:tc>
       </w:tr>
       <w:tr>
+        <w:trPr>
+          <w:cantSplit/>
+        </w:trPr>
         <w:tc>
           <w:tcPr>
             <w:tcW w:type="dxa" w:w="1814"/>
@@ -302,6 +309,9 @@
         </w:tc>
       </w:tr>
       <w:tr>
+        <w:trPr>
+          <w:cantSplit/>
+        </w:trPr>
         <w:tc>
           <w:tcPr>
             <w:tcW w:type="dxa" w:w="1814"/>
@@ -353,6 +363,9 @@
         </w:tc>
       </w:tr>
       <w:tr>
+        <w:trPr>
+          <w:cantSplit/>
+        </w:trPr>
         <w:tc>
           <w:tcPr>
             <w:tcW w:type="dxa" w:w="1814"/>
@@ -406,6 +419,9 @@
         </w:tc>
       </w:tr>
       <w:tr>
+        <w:trPr>
+          <w:cantSplit/>
+        </w:trPr>
         <w:tc>
           <w:tcPr>
             <w:tcW w:type="dxa" w:w="1814"/>
@@ -496,6 +512,7 @@
       <w:tr>
         <w:trPr>
           <w:tblHeader w:val="true"/>
+          <w:cantSplit/>
         </w:trPr>
         <w:tc>
           <w:tcPr>
@@ -580,6 +597,9 @@
         </w:tc>
       </w:tr>
       <w:tr>
+        <w:trPr>
+          <w:cantSplit/>
+        </w:trPr>
         <w:tc>
           <w:tcPr>
             <w:tcW w:type="dxa" w:w="1247"/>
@@ -655,6 +675,9 @@
         </w:tc>
       </w:tr>
       <w:tr>
+        <w:trPr>
+          <w:cantSplit/>
+        </w:trPr>
         <w:tc>
           <w:tcPr>
             <w:tcW w:type="dxa" w:w="1247"/>
@@ -733,6 +756,9 @@
         </w:tc>
       </w:tr>
       <w:tr>
+        <w:trPr>
+          <w:cantSplit/>
+        </w:trPr>
         <w:tc>
           <w:tcPr>
             <w:tcW w:type="dxa" w:w="1247"/>
@@ -803,6 +829,41 @@
                 <w:sz w:val="17"/>
               </w:rPr>
               <w:t>明确产品形态为面向用户的 Web 端应用与配套服务端，调整浏览器权限、兼容和缓存要求</w:t>
+            </w:r>
+          </w:p>
+        </w:tc>
+      </w:tr>
+      <w:tr>
+        <w:trPr>
+          <w:cantSplit/>
+        </w:trPr>
+        <w:tc>
+          <w:tcPr>
+            <w:tcW w:type="dxa" w:w="3173"/>
+          </w:tcPr>
+          <w:p>
+            <w:r>
+              <w:t>V2.2</w:t>
+            </w:r>
+          </w:p>
+        </w:tc>
+        <w:tc>
+          <w:tcPr>
+            <w:tcW w:type="dxa" w:w="3173"/>
+          </w:tcPr>
+          <w:p>
+            <w:r>
+              <w:t>2026年9月20日</w:t>
+            </w:r>
+          </w:p>
+        </w:tc>
+        <w:tc>
+          <w:tcPr>
+            <w:tcW w:type="dxa" w:w="3173"/>
+          </w:tcPr>
+          <w:p>
+            <w:r>
+              <w:t>增加技术验证阶段，收敛首期实时评分范围，补充内部设备能力分层、算法分层验收和降级规则</w:t>
             </w:r>
           </w:p>
         </w:tc>
@@ -826,7 +887,7 @@
     </w:p>
     <w:p>
       <w:pPr>
-        <w:spacing w:after="60"/>
+        <w:spacing w:after="120"/>
         <w:ind w:left="369" w:hanging="369"/>
       </w:pPr>
       <w:r>
@@ -838,7 +899,7 @@
     </w:p>
     <w:p>
       <w:pPr>
-        <w:spacing w:after="60"/>
+        <w:spacing w:after="120"/>
         <w:ind w:left="369" w:hanging="369"/>
       </w:pPr>
       <w:r>
@@ -850,7 +911,7 @@
     </w:p>
     <w:p>
       <w:pPr>
-        <w:spacing w:after="60"/>
+        <w:spacing w:after="120"/>
         <w:ind w:left="369" w:hanging="369"/>
       </w:pPr>
       <w:r>
@@ -862,7 +923,7 @@
     </w:p>
     <w:p>
       <w:pPr>
-        <w:spacing w:after="60"/>
+        <w:spacing w:after="120"/>
         <w:ind w:left="369" w:hanging="369"/>
       </w:pPr>
       <w:r>
@@ -874,7 +935,7 @@
     </w:p>
     <w:p>
       <w:pPr>
-        <w:spacing w:after="60"/>
+        <w:spacing w:after="120"/>
         <w:ind w:left="369" w:hanging="369"/>
       </w:pPr>
       <w:r>
@@ -886,7 +947,7 @@
     </w:p>
     <w:p>
       <w:pPr>
-        <w:spacing w:after="60"/>
+        <w:spacing w:after="120"/>
         <w:ind w:left="369" w:hanging="369"/>
       </w:pPr>
       <w:r>
@@ -898,7 +959,7 @@
     </w:p>
     <w:p>
       <w:pPr>
-        <w:spacing w:after="60"/>
+        <w:spacing w:after="120"/>
         <w:ind w:left="369" w:hanging="369"/>
       </w:pPr>
       <w:r>
@@ -910,7 +971,7 @@
     </w:p>
     <w:p>
       <w:pPr>
-        <w:spacing w:after="60"/>
+        <w:spacing w:after="120"/>
         <w:ind w:left="369" w:hanging="369"/>
       </w:pPr>
       <w:r>
@@ -922,7 +983,7 @@
     </w:p>
     <w:p>
       <w:pPr>
-        <w:spacing w:after="60"/>
+        <w:spacing w:after="120"/>
         <w:ind w:left="369" w:hanging="369"/>
       </w:pPr>
       <w:r>
@@ -934,7 +995,7 @@
     </w:p>
     <w:p>
       <w:pPr>
-        <w:spacing w:after="60"/>
+        <w:spacing w:after="120"/>
         <w:ind w:left="369" w:hanging="369"/>
       </w:pPr>
       <w:r>
@@ -946,7 +1007,7 @@
     </w:p>
     <w:p>
       <w:pPr>
-        <w:spacing w:after="60"/>
+        <w:spacing w:after="120"/>
         <w:ind w:left="369" w:hanging="369"/>
       </w:pPr>
       <w:r>
@@ -958,7 +1019,7 @@
     </w:p>
     <w:p>
       <w:pPr>
-        <w:spacing w:after="60"/>
+        <w:spacing w:after="120"/>
         <w:ind w:left="369" w:hanging="369"/>
       </w:pPr>
       <w:r>
@@ -970,7 +1031,7 @@
     </w:p>
     <w:p>
       <w:pPr>
-        <w:spacing w:after="60"/>
+        <w:spacing w:after="120"/>
         <w:ind w:left="369" w:hanging="369"/>
       </w:pPr>
       <w:r>
@@ -1063,6 +1124,7 @@
       <w:tr>
         <w:trPr>
           <w:tblHeader w:val="true"/>
+          <w:cantSplit/>
         </w:trPr>
         <w:tc>
           <w:tcPr>
@@ -1147,6 +1209,9 @@
         </w:tc>
       </w:tr>
       <w:tr>
+        <w:trPr>
+          <w:cantSplit/>
+        </w:trPr>
         <w:tc>
           <w:tcPr>
             <w:tcW w:type="dxa" w:w="1701"/>
@@ -1222,6 +1287,9 @@
         </w:tc>
       </w:tr>
       <w:tr>
+        <w:trPr>
+          <w:cantSplit/>
+        </w:trPr>
         <w:tc>
           <w:tcPr>
             <w:tcW w:type="dxa" w:w="1701"/>
@@ -1300,6 +1368,9 @@
         </w:tc>
       </w:tr>
       <w:tr>
+        <w:trPr>
+          <w:cantSplit/>
+        </w:trPr>
         <w:tc>
           <w:tcPr>
             <w:tcW w:type="dxa" w:w="1701"/>
@@ -1375,6 +1446,9 @@
         </w:tc>
       </w:tr>
       <w:tr>
+        <w:trPr>
+          <w:cantSplit/>
+        </w:trPr>
         <w:tc>
           <w:tcPr>
             <w:tcW w:type="dxa" w:w="1701"/>
@@ -1453,6 +1527,9 @@
         </w:tc>
       </w:tr>
       <w:tr>
+        <w:trPr>
+          <w:cantSplit/>
+        </w:trPr>
         <w:tc>
           <w:tcPr>
             <w:tcW w:type="dxa" w:w="1701"/>
@@ -1638,6 +1715,7 @@
       <w:tr>
         <w:trPr>
           <w:tblHeader w:val="true"/>
+          <w:cantSplit/>
         </w:trPr>
         <w:tc>
           <w:tcPr>
@@ -1749,6 +1827,9 @@
         </w:tc>
       </w:tr>
       <w:tr>
+        <w:trPr>
+          <w:cantSplit/>
+        </w:trPr>
         <w:tc>
           <w:tcPr>
             <w:tcW w:type="dxa" w:w="1701"/>
@@ -1848,6 +1929,9 @@
         </w:tc>
       </w:tr>
       <w:tr>
+        <w:trPr>
+          <w:cantSplit/>
+        </w:trPr>
         <w:tc>
           <w:tcPr>
             <w:tcW w:type="dxa" w:w="1701"/>
@@ -1951,6 +2035,9 @@
         </w:tc>
       </w:tr>
       <w:tr>
+        <w:trPr>
+          <w:cantSplit/>
+        </w:trPr>
         <w:tc>
           <w:tcPr>
             <w:tcW w:type="dxa" w:w="1701"/>
@@ -2149,6 +2236,7 @@
       <w:tr>
         <w:trPr>
           <w:tblHeader w:val="true"/>
+          <w:cantSplit/>
         </w:trPr>
         <w:tc>
           <w:tcPr>
@@ -2260,6 +2348,9 @@
         </w:tc>
       </w:tr>
       <w:tr>
+        <w:trPr>
+          <w:cantSplit/>
+        </w:trPr>
         <w:tc>
           <w:tcPr>
             <w:tcW w:type="dxa" w:w="1417"/>
@@ -2359,6 +2450,9 @@
         </w:tc>
       </w:tr>
       <w:tr>
+        <w:trPr>
+          <w:cantSplit/>
+        </w:trPr>
         <w:tc>
           <w:tcPr>
             <w:tcW w:type="dxa" w:w="1417"/>
@@ -2462,6 +2556,9 @@
         </w:tc>
       </w:tr>
       <w:tr>
+        <w:trPr>
+          <w:cantSplit/>
+        </w:trPr>
         <w:tc>
           <w:tcPr>
             <w:tcW w:type="dxa" w:w="1417"/>
@@ -2561,6 +2658,9 @@
         </w:tc>
       </w:tr>
       <w:tr>
+        <w:trPr>
+          <w:cantSplit/>
+        </w:trPr>
         <w:tc>
           <w:tcPr>
             <w:tcW w:type="dxa" w:w="1417"/>
@@ -2664,6 +2764,9 @@
         </w:tc>
       </w:tr>
       <w:tr>
+        <w:trPr>
+          <w:cantSplit/>
+        </w:trPr>
         <w:tc>
           <w:tcPr>
             <w:tcW w:type="dxa" w:w="1417"/>
@@ -2813,6 +2916,7 @@
       <w:tr>
         <w:trPr>
           <w:tblHeader w:val="true"/>
+          <w:cantSplit/>
         </w:trPr>
         <w:tc>
           <w:tcPr>
@@ -2897,6 +3001,9 @@
         </w:tc>
       </w:tr>
       <w:tr>
+        <w:trPr>
+          <w:cantSplit/>
+        </w:trPr>
         <w:tc>
           <w:tcPr>
             <w:tcW w:type="dxa" w:w="1701"/>
@@ -2972,6 +3079,9 @@
         </w:tc>
       </w:tr>
       <w:tr>
+        <w:trPr>
+          <w:cantSplit/>
+        </w:trPr>
         <w:tc>
           <w:tcPr>
             <w:tcW w:type="dxa" w:w="1701"/>
@@ -3050,6 +3160,9 @@
         </w:tc>
       </w:tr>
       <w:tr>
+        <w:trPr>
+          <w:cantSplit/>
+        </w:trPr>
         <w:tc>
           <w:tcPr>
             <w:tcW w:type="dxa" w:w="1701"/>
@@ -3125,6 +3238,9 @@
         </w:tc>
       </w:tr>
       <w:tr>
+        <w:trPr>
+          <w:cantSplit/>
+        </w:trPr>
         <w:tc>
           <w:tcPr>
             <w:tcW w:type="dxa" w:w="1701"/>
@@ -3203,6 +3319,9 @@
         </w:tc>
       </w:tr>
       <w:tr>
+        <w:trPr>
+          <w:cantSplit/>
+        </w:trPr>
         <w:tc>
           <w:tcPr>
             <w:tcW w:type="dxa" w:w="1701"/>
@@ -3278,6 +3397,9 @@
         </w:tc>
       </w:tr>
       <w:tr>
+        <w:trPr>
+          <w:cantSplit/>
+        </w:trPr>
         <w:tc>
           <w:tcPr>
             <w:tcW w:type="dxa" w:w="1701"/>
@@ -3356,6 +3478,9 @@
         </w:tc>
       </w:tr>
       <w:tr>
+        <w:trPr>
+          <w:cantSplit/>
+        </w:trPr>
         <w:tc>
           <w:tcPr>
             <w:tcW w:type="dxa" w:w="1701"/>
@@ -3431,6 +3556,9 @@
         </w:tc>
       </w:tr>
       <w:tr>
+        <w:trPr>
+          <w:cantSplit/>
+        </w:trPr>
         <w:tc>
           <w:tcPr>
             <w:tcW w:type="dxa" w:w="1701"/>
@@ -3509,6 +3637,9 @@
         </w:tc>
       </w:tr>
       <w:tr>
+        <w:trPr>
+          <w:cantSplit/>
+        </w:trPr>
         <w:tc>
           <w:tcPr>
             <w:tcW w:type="dxa" w:w="1701"/>
@@ -3605,7 +3736,7 @@
         <w:rPr>
           <w:rFonts w:ascii="Microsoft YaHei" w:hAnsi="Microsoft YaHei" w:eastAsia="微软雅黑"/>
         </w:rPr>
-        <w:t>阶段划分用于解决算法、内容和平台能力之间的依赖，不代表产品只建设最小版本。每个阶段都应满足对应验收标准后再扩大乐器和内容范围。</w:t>
+        <w:t>阶段划分用于解决算法、内容和平台能力之间的依赖，不代表产品只建设最小版本。阶段零预计 4 至 6 周，完成技术与评测基线后再冻结阶段一指标。后续每个阶段均须满足对应验收标准，算法能力按乐器和练习类型逐项开放，不以课程已经上线代替算法验收。</w:t>
       </w:r>
     </w:p>
     <w:tbl>
@@ -3631,6 +3762,7 @@
       <w:tr>
         <w:trPr>
           <w:tblHeader w:val="true"/>
+          <w:cantSplit/>
         </w:trPr>
         <w:tc>
           <w:tcPr>
@@ -3715,6 +3847,44 @@
         </w:tc>
       </w:tr>
       <w:tr>
+        <w:trPr>
+          <w:cantSplit/>
+        </w:trPr>
+        <w:tc>
+          <w:tcPr>
+            <w:tcW w:type="dxa" w:w="3173"/>
+          </w:tcPr>
+          <w:p>
+            <w:r>
+              <w:t>阶段零 技术验证</w:t>
+            </w:r>
+          </w:p>
+        </w:tc>
+        <w:tc>
+          <w:tcPr>
+            <w:tcW w:type="dxa" w:w="3173"/>
+          </w:tcPr>
+          <w:p>
+            <w:r>
+              <w:t>浏览器采集链路、内部设备能力矩阵、钢琴与小提琴单音识别、延迟基线、分乐器测试集</w:t>
+            </w:r>
+          </w:p>
+        </w:tc>
+        <w:tc>
+          <w:tcPr>
+            <w:tcW w:type="dxa" w:w="3173"/>
+          </w:tcPr>
+          <w:p>
+            <w:r>
+              <w:t>形成可复现评测报告，明确支持条件、降级路径和阶段一发布门槛</w:t>
+            </w:r>
+          </w:p>
+        </w:tc>
+      </w:tr>
+      <w:tr>
+        <w:trPr>
+          <w:cantSplit/>
+        </w:trPr>
         <w:tc>
           <w:tcPr>
             <w:tcW w:type="dxa" w:w="1814"/>
@@ -3790,6 +3960,9 @@
         </w:tc>
       </w:tr>
       <w:tr>
+        <w:trPr>
+          <w:cantSplit/>
+        </w:trPr>
         <w:tc>
           <w:tcPr>
             <w:tcW w:type="dxa" w:w="1814"/>
@@ -3868,6 +4041,9 @@
         </w:tc>
       </w:tr>
       <w:tr>
+        <w:trPr>
+          <w:cantSplit/>
+        </w:trPr>
         <w:tc>
           <w:tcPr>
             <w:tcW w:type="dxa" w:w="1814"/>
@@ -3943,6 +4119,9 @@
         </w:tc>
       </w:tr>
       <w:tr>
+        <w:trPr>
+          <w:cantSplit/>
+        </w:trPr>
         <w:tc>
           <w:tcPr>
             <w:tcW w:type="dxa" w:w="1814"/>
@@ -4101,7 +4280,7 @@
         <w:rPr>
           <w:rFonts w:ascii="Microsoft YaHei" w:hAnsi="Microsoft YaHei" w:eastAsia="微软雅黑"/>
         </w:rPr>
-        <w:t>首期内容覆盖钢琴、小提琴、吉他和小号四种典型乐器。课程以入门学习为主，先保证基础概念、示范、练习和反馈闭环，不在初期加入复杂演奏技法。</w:t>
+        <w:t>首期课程覆盖钢琴、小提琴、吉他和小号四种典型乐器，以入门概念、示范和基础练习为主。首期实时 AI 评分仅面向通过阶段零验证的钢琴与小提琴单音练习；吉他和小号先提供课程、工具、非实时练习或录音后分析，不以实时评分作为首期课程上线条件。</w:t>
       </w:r>
     </w:p>
     <w:tbl>
@@ -4127,6 +4306,7 @@
       <w:tr>
         <w:trPr>
           <w:tblHeader w:val="true"/>
+          <w:cantSplit/>
         </w:trPr>
         <w:tc>
           <w:tcPr>
@@ -4211,6 +4391,9 @@
         </w:tc>
       </w:tr>
       <w:tr>
+        <w:trPr>
+          <w:cantSplit/>
+        </w:trPr>
         <w:tc>
           <w:tcPr>
             <w:tcW w:type="dxa" w:w="1531"/>
@@ -4272,20 +4455,16 @@
             <w:vAlign w:val="center"/>
           </w:tcPr>
           <w:p>
-            <w:pPr>
-              <w:spacing w:after="0" w:line="276" w:lineRule="auto"/>
-            </w:pPr>
-            <w:r>
-              <w:rPr>
-                <w:rFonts w:ascii="Microsoft YaHei" w:hAnsi="Microsoft YaHei" w:eastAsia="微软雅黑"/>
-                <w:sz w:val="17"/>
-              </w:rPr>
-              <w:t>单音识别、音阶练习、左右手分开练习</w:t>
+            <w:r>
+              <w:t>单音识别、音阶练习、左右手分开练习；首期开放通过验收的实时单音评分</w:t>
             </w:r>
           </w:p>
         </w:tc>
       </w:tr>
       <w:tr>
+        <w:trPr>
+          <w:cantSplit/>
+        </w:trPr>
         <w:tc>
           <w:tcPr>
             <w:tcW w:type="dxa" w:w="1531"/>
@@ -4350,20 +4529,16 @@
             <w:vAlign w:val="center"/>
           </w:tcPr>
           <w:p>
-            <w:pPr>
-              <w:spacing w:after="0" w:line="276" w:lineRule="auto"/>
-            </w:pPr>
-            <w:r>
-              <w:rPr>
-                <w:rFonts w:ascii="Microsoft YaHei" w:hAnsi="Microsoft YaHei" w:eastAsia="微软雅黑"/>
-                <w:sz w:val="17"/>
-              </w:rPr>
-              <w:t>空弦识别、长弓稳定性、基础音准练习</w:t>
+            <w:r>
+              <w:t>空弦识别、长弓稳定性、基础音准练习；首期开放通过验收的实时单音评分</w:t>
             </w:r>
           </w:p>
         </w:tc>
       </w:tr>
       <w:tr>
+        <w:trPr>
+          <w:cantSplit/>
+        </w:trPr>
         <w:tc>
           <w:tcPr>
             <w:tcW w:type="dxa" w:w="1531"/>
@@ -4425,20 +4600,16 @@
             <w:vAlign w:val="center"/>
           </w:tcPr>
           <w:p>
-            <w:pPr>
-              <w:spacing w:after="0" w:line="276" w:lineRule="auto"/>
-            </w:pPr>
-            <w:r>
-              <w:rPr>
-                <w:rFonts w:ascii="Microsoft YaHei" w:hAnsi="Microsoft YaHei" w:eastAsia="微软雅黑"/>
-                <w:sz w:val="17"/>
-              </w:rPr>
-              <w:t>单弦音高、和弦组成音、节奏型练习</w:t>
+            <w:r>
+              <w:t>调音、单弦音高、和弦组成与节奏型非评分练习；和弦识别在后续阶段单独验证</w:t>
             </w:r>
           </w:p>
         </w:tc>
       </w:tr>
       <w:tr>
+        <w:trPr>
+          <w:cantSplit/>
+        </w:trPr>
         <w:tc>
           <w:tcPr>
             <w:tcW w:type="dxa" w:w="1531"/>
@@ -4503,15 +4674,8 @@
             <w:vAlign w:val="center"/>
           </w:tcPr>
           <w:p>
-            <w:pPr>
-              <w:spacing w:after="0" w:line="276" w:lineRule="auto"/>
-            </w:pPr>
-            <w:r>
-              <w:rPr>
-                <w:rFonts w:ascii="Microsoft YaHei" w:hAnsi="Microsoft YaHei" w:eastAsia="微软雅黑"/>
-                <w:sz w:val="17"/>
-              </w:rPr>
-              <w:t>长音稳定性、基础音高、节奏与乐句练习</w:t>
+            <w:r>
+              <w:t>长音工具、基础音高与乐句练习、录音后分析；实时评分在后续阶段单独验证</w:t>
             </w:r>
           </w:p>
         </w:tc>
@@ -4527,7 +4691,7 @@
         <w:rPr>
           <w:rFonts w:ascii="Microsoft YaHei" w:hAnsi="Microsoft YaHei" w:eastAsia="微软雅黑"/>
         </w:rPr>
-        <w:t>课程中的姿势与吹奏提示使用审核后的固定内容。AI 主要负责识别音高、节奏和完成情况，不根据音频单独推断用户的身体动作。</w:t>
+        <w:t>课程中的姿势与吹奏提示使用审核后的固定内容。AI 主要负责识别音高、节奏和完成情况，不根据音频单独推断用户的身体动作。课程支持范围与实时评分支持范围分别管理；任何评分能力仅在对应乐器、练习类型和内部设备能力档位通过验收后灰度开放。</w:t>
       </w:r>
     </w:p>
     <w:p>
@@ -4564,6 +4728,7 @@
       <w:tr>
         <w:trPr>
           <w:tblHeader w:val="true"/>
+          <w:cantSplit/>
         </w:trPr>
         <w:tc>
           <w:tcPr>
@@ -4648,6 +4813,9 @@
         </w:tc>
       </w:tr>
       <w:tr>
+        <w:trPr>
+          <w:cantSplit/>
+        </w:trPr>
         <w:tc>
           <w:tcPr>
             <w:tcW w:type="dxa" w:w="1701"/>
@@ -4723,6 +4891,9 @@
         </w:tc>
       </w:tr>
       <w:tr>
+        <w:trPr>
+          <w:cantSplit/>
+        </w:trPr>
         <w:tc>
           <w:tcPr>
             <w:tcW w:type="dxa" w:w="1701"/>
@@ -4801,6 +4972,9 @@
         </w:tc>
       </w:tr>
       <w:tr>
+        <w:trPr>
+          <w:cantSplit/>
+        </w:trPr>
         <w:tc>
           <w:tcPr>
             <w:tcW w:type="dxa" w:w="1701"/>
@@ -4876,6 +5050,9 @@
         </w:tc>
       </w:tr>
       <w:tr>
+        <w:trPr>
+          <w:cantSplit/>
+        </w:trPr>
         <w:tc>
           <w:tcPr>
             <w:tcW w:type="dxa" w:w="1701"/>
@@ -4954,6 +5131,9 @@
         </w:tc>
       </w:tr>
       <w:tr>
+        <w:trPr>
+          <w:cantSplit/>
+        </w:trPr>
         <w:tc>
           <w:tcPr>
             <w:tcW w:type="dxa" w:w="1701"/>
@@ -5207,7 +5387,7 @@
         <w:rPr>
           <w:rFonts w:ascii="Microsoft YaHei" w:hAnsi="Microsoft YaHei" w:eastAsia="微软雅黑"/>
         </w:rPr>
-        <w:t>2.  系统检查麦克风权限、输入音量、环境噪声和设备兼容性。</w:t>
+        <w:t>2.  系统检查麦克风权限、输入音量、环境噪声、浏览器音频能力和采集链路延迟，并完成必要的短时校准。</w:t>
       </w:r>
     </w:p>
     <w:p>
@@ -5219,7 +5399,7 @@
         <w:rPr>
           <w:rFonts w:ascii="Microsoft YaHei" w:hAnsi="Microsoft YaHei" w:eastAsia="微软雅黑"/>
         </w:rPr>
-        <w:t>3.  倒计时结束后开始采集，界面显示当前音符和下一音符。</w:t>
+        <w:t>3.  系统根据能力检测结果进入可评分、降级分析或设备不支持状态；可评分时在倒计时后开始采集并显示当前音符和下一音符。</w:t>
       </w:r>
     </w:p>
     <w:p>
@@ -5231,7 +5411,7 @@
         <w:rPr>
           <w:rFonts w:ascii="Microsoft YaHei" w:hAnsi="Microsoft YaHei" w:eastAsia="微软雅黑"/>
         </w:rPr>
-        <w:t>4.  系统根据时间窗口匹配目标音符，反馈正确、错误、漏弹或暂时无法判断。</w:t>
+        <w:t>4.  系统根据时间窗口匹配目标音符，反馈正确、错误、漏弹或低置信度无法判断；无法满足实时评分条件时转为录音后分析或非评分练习，不输出低可信实时结论。</w:t>
       </w:r>
     </w:p>
     <w:p>
@@ -5255,7 +5435,7 @@
         <w:rPr>
           <w:rFonts w:ascii="Microsoft YaHei" w:hAnsi="Microsoft YaHei" w:eastAsia="微软雅黑"/>
         </w:rPr>
-        <w:t>6.  系统生成报告，展示准确率、节奏偏差、易错位置和建议练习。</w:t>
+        <w:t>6.  系统生成报告，展示准确率、有效识别覆盖率、节奏偏差、易错位置、算法版本、适用条件和建议练习；降级分析报告须明确其处理方式。</w:t>
       </w:r>
     </w:p>
     <w:p>
@@ -5434,6 +5614,7 @@
       <w:tr>
         <w:trPr>
           <w:tblHeader w:val="true"/>
+          <w:cantSplit/>
         </w:trPr>
         <w:tc>
           <w:tcPr>
@@ -5518,6 +5699,9 @@
         </w:tc>
       </w:tr>
       <w:tr>
+        <w:trPr>
+          <w:cantSplit/>
+        </w:trPr>
         <w:tc>
           <w:tcPr>
             <w:tcW w:type="dxa" w:w="1928"/>
@@ -5593,6 +5777,9 @@
         </w:tc>
       </w:tr>
       <w:tr>
+        <w:trPr>
+          <w:cantSplit/>
+        </w:trPr>
         <w:tc>
           <w:tcPr>
             <w:tcW w:type="dxa" w:w="1928"/>
@@ -5671,6 +5858,9 @@
         </w:tc>
       </w:tr>
       <w:tr>
+        <w:trPr>
+          <w:cantSplit/>
+        </w:trPr>
         <w:tc>
           <w:tcPr>
             <w:tcW w:type="dxa" w:w="1928"/>
@@ -5746,6 +5936,9 @@
         </w:tc>
       </w:tr>
       <w:tr>
+        <w:trPr>
+          <w:cantSplit/>
+        </w:trPr>
         <w:tc>
           <w:tcPr>
             <w:tcW w:type="dxa" w:w="1928"/>
@@ -5824,6 +6017,9 @@
         </w:tc>
       </w:tr>
       <w:tr>
+        <w:trPr>
+          <w:cantSplit/>
+        </w:trPr>
         <w:tc>
           <w:tcPr>
             <w:tcW w:type="dxa" w:w="1928"/>
@@ -5899,6 +6095,9 @@
         </w:tc>
       </w:tr>
       <w:tr>
+        <w:trPr>
+          <w:cantSplit/>
+        </w:trPr>
         <w:tc>
           <w:tcPr>
             <w:tcW w:type="dxa" w:w="1928"/>
@@ -5977,6 +6176,9 @@
         </w:tc>
       </w:tr>
       <w:tr>
+        <w:trPr>
+          <w:cantSplit/>
+        </w:trPr>
         <w:tc>
           <w:tcPr>
             <w:tcW w:type="dxa" w:w="1928"/>
@@ -6046,6 +6248,76 @@
                 <w:sz w:val="17"/>
               </w:rPr>
               <w:t>返回页面后继续练习 结束并生成部分报告</w:t>
+            </w:r>
+          </w:p>
+        </w:tc>
+      </w:tr>
+      <w:tr>
+        <w:trPr>
+          <w:cantSplit/>
+        </w:trPr>
+        <w:tc>
+          <w:tcPr>
+            <w:tcW w:type="dxa" w:w="3173"/>
+          </w:tcPr>
+          <w:p>
+            <w:r>
+              <w:t>实时音频能力不可用</w:t>
+            </w:r>
+          </w:p>
+        </w:tc>
+        <w:tc>
+          <w:tcPr>
+            <w:tcW w:type="dxa" w:w="3173"/>
+          </w:tcPr>
+          <w:p>
+            <w:r>
+              <w:t>标记设备不支持实时评分，不启动评分链路</w:t>
+            </w:r>
+          </w:p>
+        </w:tc>
+        <w:tc>
+          <w:tcPr>
+            <w:tcW w:type="dxa" w:w="3173"/>
+          </w:tcPr>
+          <w:p>
+            <w:r>
+              <w:t>使用录音后分析 使用非评分练习</w:t>
+            </w:r>
+          </w:p>
+        </w:tc>
+      </w:tr>
+      <w:tr>
+        <w:trPr>
+          <w:cantSplit/>
+        </w:trPr>
+        <w:tc>
+          <w:tcPr>
+            <w:tcW w:type="dxa" w:w="3173"/>
+          </w:tcPr>
+          <w:p>
+            <w:r>
+              <w:t>端侧性能持续不足</w:t>
+            </w:r>
+          </w:p>
+        </w:tc>
+        <w:tc>
+          <w:tcPr>
+            <w:tcW w:type="dxa" w:w="3173"/>
+          </w:tcPr>
+          <w:p>
+            <w:r>
+              <w:t>停止实时评分并保存已完成结果，避免继续输出延迟反馈</w:t>
+            </w:r>
+          </w:p>
+        </w:tc>
+        <w:tc>
+          <w:tcPr>
+            <w:tcW w:type="dxa" w:w="3173"/>
+          </w:tcPr>
+          <w:p>
+            <w:r>
+              <w:t>转为降级分析 结束并生成部分报告</w:t>
             </w:r>
           </w:p>
         </w:tc>
@@ -6101,6 +6373,7 @@
       <w:tr>
         <w:trPr>
           <w:tblHeader w:val="true"/>
+          <w:cantSplit/>
         </w:trPr>
         <w:tc>
           <w:tcPr>
@@ -6185,6 +6458,9 @@
         </w:tc>
       </w:tr>
       <w:tr>
+        <w:trPr>
+          <w:cantSplit/>
+        </w:trPr>
         <w:tc>
           <w:tcPr>
             <w:tcW w:type="dxa" w:w="1417"/>
@@ -6260,6 +6536,9 @@
         </w:tc>
       </w:tr>
       <w:tr>
+        <w:trPr>
+          <w:cantSplit/>
+        </w:trPr>
         <w:tc>
           <w:tcPr>
             <w:tcW w:type="dxa" w:w="1417"/>
@@ -6338,6 +6617,9 @@
         </w:tc>
       </w:tr>
       <w:tr>
+        <w:trPr>
+          <w:cantSplit/>
+        </w:trPr>
         <w:tc>
           <w:tcPr>
             <w:tcW w:type="dxa" w:w="1417"/>
@@ -6413,6 +6695,9 @@
         </w:tc>
       </w:tr>
       <w:tr>
+        <w:trPr>
+          <w:cantSplit/>
+        </w:trPr>
         <w:tc>
           <w:tcPr>
             <w:tcW w:type="dxa" w:w="1417"/>
@@ -6530,6 +6815,7 @@
       <w:tr>
         <w:trPr>
           <w:tblHeader w:val="true"/>
+          <w:cantSplit/>
         </w:trPr>
         <w:tc>
           <w:tcPr>
@@ -6614,6 +6900,9 @@
         </w:tc>
       </w:tr>
       <w:tr>
+        <w:trPr>
+          <w:cantSplit/>
+        </w:trPr>
         <w:tc>
           <w:tcPr>
             <w:tcW w:type="dxa" w:w="1417"/>
@@ -6689,6 +6978,9 @@
         </w:tc>
       </w:tr>
       <w:tr>
+        <w:trPr>
+          <w:cantSplit/>
+        </w:trPr>
         <w:tc>
           <w:tcPr>
             <w:tcW w:type="dxa" w:w="1417"/>
@@ -6767,6 +7059,9 @@
         </w:tc>
       </w:tr>
       <w:tr>
+        <w:trPr>
+          <w:cantSplit/>
+        </w:trPr>
         <w:tc>
           <w:tcPr>
             <w:tcW w:type="dxa" w:w="1417"/>
@@ -6842,6 +7137,9 @@
         </w:tc>
       </w:tr>
       <w:tr>
+        <w:trPr>
+          <w:cantSplit/>
+        </w:trPr>
         <w:tc>
           <w:tcPr>
             <w:tcW w:type="dxa" w:w="1417"/>
@@ -6920,6 +7218,9 @@
         </w:tc>
       </w:tr>
       <w:tr>
+        <w:trPr>
+          <w:cantSplit/>
+        </w:trPr>
         <w:tc>
           <w:tcPr>
             <w:tcW w:type="dxa" w:w="1417"/>
@@ -6995,6 +7296,9 @@
         </w:tc>
       </w:tr>
       <w:tr>
+        <w:trPr>
+          <w:cantSplit/>
+        </w:trPr>
         <w:tc>
           <w:tcPr>
             <w:tcW w:type="dxa" w:w="1417"/>
@@ -7112,6 +7416,7 @@
       <w:tr>
         <w:trPr>
           <w:tblHeader w:val="true"/>
+          <w:cantSplit/>
         </w:trPr>
         <w:tc>
           <w:tcPr>
@@ -7196,6 +7501,9 @@
         </w:tc>
       </w:tr>
       <w:tr>
+        <w:trPr>
+          <w:cantSplit/>
+        </w:trPr>
         <w:tc>
           <w:tcPr>
             <w:tcW w:type="dxa" w:w="1531"/>
@@ -7271,6 +7579,9 @@
         </w:tc>
       </w:tr>
       <w:tr>
+        <w:trPr>
+          <w:cantSplit/>
+        </w:trPr>
         <w:tc>
           <w:tcPr>
             <w:tcW w:type="dxa" w:w="1531"/>
@@ -7349,6 +7660,9 @@
         </w:tc>
       </w:tr>
       <w:tr>
+        <w:trPr>
+          <w:cantSplit/>
+        </w:trPr>
         <w:tc>
           <w:tcPr>
             <w:tcW w:type="dxa" w:w="1531"/>
@@ -7424,6 +7738,9 @@
         </w:tc>
       </w:tr>
       <w:tr>
+        <w:trPr>
+          <w:cantSplit/>
+        </w:trPr>
         <w:tc>
           <w:tcPr>
             <w:tcW w:type="dxa" w:w="1531"/>
@@ -7502,6 +7819,9 @@
         </w:tc>
       </w:tr>
       <w:tr>
+        <w:trPr>
+          <w:cantSplit/>
+        </w:trPr>
         <w:tc>
           <w:tcPr>
             <w:tcW w:type="dxa" w:w="1531"/>
@@ -7577,6 +7897,9 @@
         </w:tc>
       </w:tr>
       <w:tr>
+        <w:trPr>
+          <w:cantSplit/>
+        </w:trPr>
         <w:tc>
           <w:tcPr>
             <w:tcW w:type="dxa" w:w="1531"/>
@@ -7655,6 +7978,9 @@
         </w:tc>
       </w:tr>
       <w:tr>
+        <w:trPr>
+          <w:cantSplit/>
+        </w:trPr>
         <w:tc>
           <w:tcPr>
             <w:tcW w:type="dxa" w:w="1531"/>
@@ -7725,6 +8051,111 @@
                 <w:sz w:val="17"/>
               </w:rPr>
               <w:t>报告可定位至音符和小节，并支持回听相关片段</w:t>
+            </w:r>
+          </w:p>
+        </w:tc>
+      </w:tr>
+      <w:tr>
+        <w:trPr>
+          <w:cantSplit/>
+        </w:trPr>
+        <w:tc>
+          <w:tcPr>
+            <w:tcW w:type="dxa" w:w="3173"/>
+          </w:tcPr>
+          <w:p>
+            <w:r>
+              <w:t>PRACTICE-08</w:t>
+            </w:r>
+          </w:p>
+        </w:tc>
+        <w:tc>
+          <w:tcPr>
+            <w:tcW w:type="dxa" w:w="3173"/>
+          </w:tcPr>
+          <w:p>
+            <w:r>
+              <w:t>设备能力检测</w:t>
+            </w:r>
+          </w:p>
+        </w:tc>
+        <w:tc>
+          <w:tcPr>
+            <w:tcW w:type="dxa" w:w="3173"/>
+          </w:tcPr>
+          <w:p>
+            <w:r>
+              <w:t>检测安全上下文、音频处理能力、采集参数和性能状态；结果仅用于内部能力分层、灰度与降级</w:t>
+            </w:r>
+          </w:p>
+        </w:tc>
+      </w:tr>
+      <w:tr>
+        <w:trPr>
+          <w:cantSplit/>
+        </w:trPr>
+        <w:tc>
+          <w:tcPr>
+            <w:tcW w:type="dxa" w:w="3173"/>
+          </w:tcPr>
+          <w:p>
+            <w:r>
+              <w:t>PRACTICE-09</w:t>
+            </w:r>
+          </w:p>
+        </w:tc>
+        <w:tc>
+          <w:tcPr>
+            <w:tcW w:type="dxa" w:w="3173"/>
+          </w:tcPr>
+          <w:p>
+            <w:r>
+              <w:t>评分降级</w:t>
+            </w:r>
+          </w:p>
+        </w:tc>
+        <w:tc>
+          <w:tcPr>
+            <w:tcW w:type="dxa" w:w="3173"/>
+          </w:tcPr>
+          <w:p>
+            <w:r>
+              <w:t>统一提供可评分、低置信度无法判断、降级分析和设备不支持四类状态，不满足条件时不得继续输出实时评分</w:t>
+            </w:r>
+          </w:p>
+        </w:tc>
+      </w:tr>
+      <w:tr>
+        <w:trPr>
+          <w:cantSplit/>
+        </w:trPr>
+        <w:tc>
+          <w:tcPr>
+            <w:tcW w:type="dxa" w:w="3173"/>
+          </w:tcPr>
+          <w:p>
+            <w:r>
+              <w:t>PRACTICE-10</w:t>
+            </w:r>
+          </w:p>
+        </w:tc>
+        <w:tc>
+          <w:tcPr>
+            <w:tcW w:type="dxa" w:w="3173"/>
+          </w:tcPr>
+          <w:p>
+            <w:r>
+              <w:t>报告可追溯</w:t>
+            </w:r>
+          </w:p>
+        </w:tc>
+        <w:tc>
+          <w:tcPr>
+            <w:tcW w:type="dxa" w:w="3173"/>
+          </w:tcPr>
+          <w:p>
+            <w:r>
+              <w:t>报告显示算法版本、有效识别覆盖率和适用条件；不得只展示准确率</w:t>
             </w:r>
           </w:p>
         </w:tc>
@@ -7769,6 +8200,7 @@
       <w:tr>
         <w:trPr>
           <w:tblHeader w:val="true"/>
+          <w:cantSplit/>
         </w:trPr>
         <w:tc>
           <w:tcPr>
@@ -7853,6 +8285,9 @@
         </w:tc>
       </w:tr>
       <w:tr>
+        <w:trPr>
+          <w:cantSplit/>
+        </w:trPr>
         <w:tc>
           <w:tcPr>
             <w:tcW w:type="dxa" w:w="1417"/>
@@ -7928,6 +8363,9 @@
         </w:tc>
       </w:tr>
       <w:tr>
+        <w:trPr>
+          <w:cantSplit/>
+        </w:trPr>
         <w:tc>
           <w:tcPr>
             <w:tcW w:type="dxa" w:w="1417"/>
@@ -8006,6 +8444,9 @@
         </w:tc>
       </w:tr>
       <w:tr>
+        <w:trPr>
+          <w:cantSplit/>
+        </w:trPr>
         <w:tc>
           <w:tcPr>
             <w:tcW w:type="dxa" w:w="1417"/>
@@ -8081,6 +8522,9 @@
         </w:tc>
       </w:tr>
       <w:tr>
+        <w:trPr>
+          <w:cantSplit/>
+        </w:trPr>
         <w:tc>
           <w:tcPr>
             <w:tcW w:type="dxa" w:w="1417"/>
@@ -8159,6 +8603,9 @@
         </w:tc>
       </w:tr>
       <w:tr>
+        <w:trPr>
+          <w:cantSplit/>
+        </w:trPr>
         <w:tc>
           <w:tcPr>
             <w:tcW w:type="dxa" w:w="1417"/>
@@ -8234,6 +8681,9 @@
         </w:tc>
       </w:tr>
       <w:tr>
+        <w:trPr>
+          <w:cantSplit/>
+        </w:trPr>
         <w:tc>
           <w:tcPr>
             <w:tcW w:type="dxa" w:w="1417"/>
@@ -8351,6 +8801,7 @@
       <w:tr>
         <w:trPr>
           <w:tblHeader w:val="true"/>
+          <w:cantSplit/>
         </w:trPr>
         <w:tc>
           <w:tcPr>
@@ -8435,6 +8886,9 @@
         </w:tc>
       </w:tr>
       <w:tr>
+        <w:trPr>
+          <w:cantSplit/>
+        </w:trPr>
         <w:tc>
           <w:tcPr>
             <w:tcW w:type="dxa" w:w="1417"/>
@@ -8510,6 +8964,9 @@
         </w:tc>
       </w:tr>
       <w:tr>
+        <w:trPr>
+          <w:cantSplit/>
+        </w:trPr>
         <w:tc>
           <w:tcPr>
             <w:tcW w:type="dxa" w:w="1417"/>
@@ -8588,6 +9045,9 @@
         </w:tc>
       </w:tr>
       <w:tr>
+        <w:trPr>
+          <w:cantSplit/>
+        </w:trPr>
         <w:tc>
           <w:tcPr>
             <w:tcW w:type="dxa" w:w="1417"/>
@@ -8663,6 +9123,9 @@
         </w:tc>
       </w:tr>
       <w:tr>
+        <w:trPr>
+          <w:cantSplit/>
+        </w:trPr>
         <w:tc>
           <w:tcPr>
             <w:tcW w:type="dxa" w:w="1417"/>
@@ -8741,6 +9204,9 @@
         </w:tc>
       </w:tr>
       <w:tr>
+        <w:trPr>
+          <w:cantSplit/>
+        </w:trPr>
         <w:tc>
           <w:tcPr>
             <w:tcW w:type="dxa" w:w="1417"/>
@@ -8855,6 +9321,7 @@
       <w:tr>
         <w:trPr>
           <w:tblHeader w:val="true"/>
+          <w:cantSplit/>
         </w:trPr>
         <w:tc>
           <w:tcPr>
@@ -8939,6 +9406,9 @@
         </w:tc>
       </w:tr>
       <w:tr>
+        <w:trPr>
+          <w:cantSplit/>
+        </w:trPr>
         <w:tc>
           <w:tcPr>
             <w:tcW w:type="dxa" w:w="1417"/>
@@ -9014,6 +9484,9 @@
         </w:tc>
       </w:tr>
       <w:tr>
+        <w:trPr>
+          <w:cantSplit/>
+        </w:trPr>
         <w:tc>
           <w:tcPr>
             <w:tcW w:type="dxa" w:w="1417"/>
@@ -9092,6 +9565,9 @@
         </w:tc>
       </w:tr>
       <w:tr>
+        <w:trPr>
+          <w:cantSplit/>
+        </w:trPr>
         <w:tc>
           <w:tcPr>
             <w:tcW w:type="dxa" w:w="1417"/>
@@ -9167,6 +9643,9 @@
         </w:tc>
       </w:tr>
       <w:tr>
+        <w:trPr>
+          <w:cantSplit/>
+        </w:trPr>
         <w:tc>
           <w:tcPr>
             <w:tcW w:type="dxa" w:w="1417"/>
@@ -9245,6 +9724,9 @@
         </w:tc>
       </w:tr>
       <w:tr>
+        <w:trPr>
+          <w:cantSplit/>
+        </w:trPr>
         <w:tc>
           <w:tcPr>
             <w:tcW w:type="dxa" w:w="1417"/>
@@ -9371,6 +9853,7 @@
       <w:tr>
         <w:trPr>
           <w:tblHeader w:val="true"/>
+          <w:cantSplit/>
         </w:trPr>
         <w:tc>
           <w:tcPr>
@@ -9482,6 +9965,9 @@
         </w:tc>
       </w:tr>
       <w:tr>
+        <w:trPr>
+          <w:cantSplit/>
+        </w:trPr>
         <w:tc>
           <w:tcPr>
             <w:tcW w:type="dxa" w:w="1701"/>
@@ -9581,6 +10067,9 @@
         </w:tc>
       </w:tr>
       <w:tr>
+        <w:trPr>
+          <w:cantSplit/>
+        </w:trPr>
         <w:tc>
           <w:tcPr>
             <w:tcW w:type="dxa" w:w="1701"/>
@@ -9620,14 +10109,7 @@
             <w:vAlign w:val="center"/>
           </w:tcPr>
           <w:p>
-            <w:pPr>
-              <w:spacing w:after="0" w:line="276" w:lineRule="auto"/>
-            </w:pPr>
-            <w:r>
-              <w:rPr>
-                <w:rFonts w:ascii="Microsoft YaHei" w:hAnsi="Microsoft YaHei" w:eastAsia="微软雅黑"/>
-                <w:sz w:val="17"/>
-              </w:rPr>
+            <w:r>
               <w:t>实时单声道音频</w:t>
             </w:r>
           </w:p>
@@ -9645,14 +10127,7 @@
             <w:vAlign w:val="center"/>
           </w:tcPr>
           <w:p>
-            <w:pPr>
-              <w:spacing w:after="0" w:line="276" w:lineRule="auto"/>
-            </w:pPr>
-            <w:r>
-              <w:rPr>
-                <w:rFonts w:ascii="Microsoft YaHei" w:hAnsi="Microsoft YaHei" w:eastAsia="微软雅黑"/>
-                <w:sz w:val="17"/>
-              </w:rPr>
+            <w:r>
               <w:t>基频 音名 置信度 时间戳</w:t>
             </w:r>
           </w:p>
@@ -9670,20 +10145,16 @@
             <w:vAlign w:val="center"/>
           </w:tcPr>
           <w:p>
-            <w:pPr>
-              <w:spacing w:after="0" w:line="276" w:lineRule="auto"/>
-            </w:pPr>
-            <w:r>
-              <w:rPr>
-                <w:rFonts w:ascii="Microsoft YaHei" w:hAnsi="Microsoft YaHei" w:eastAsia="微软雅黑"/>
-                <w:sz w:val="17"/>
-              </w:rPr>
-              <w:t>按乐器与音域分别评测</w:t>
+            <w:r>
+              <w:t>按乐器、音域和内部设备能力档位分别评测</w:t>
             </w:r>
           </w:p>
         </w:tc>
       </w:tr>
       <w:tr>
+        <w:trPr>
+          <w:cantSplit/>
+        </w:trPr>
         <w:tc>
           <w:tcPr>
             <w:tcW w:type="dxa" w:w="1701"/>
@@ -9721,14 +10192,7 @@
             <w:vAlign w:val="center"/>
           </w:tcPr>
           <w:p>
-            <w:pPr>
-              <w:spacing w:after="0" w:line="276" w:lineRule="auto"/>
-            </w:pPr>
-            <w:r>
-              <w:rPr>
-                <w:rFonts w:ascii="Microsoft YaHei" w:hAnsi="Microsoft YaHei" w:eastAsia="微软雅黑"/>
-                <w:sz w:val="17"/>
-              </w:rPr>
+            <w:r>
               <w:t>稳定和弦片段</w:t>
             </w:r>
           </w:p>
@@ -9745,14 +10209,7 @@
             <w:vAlign w:val="center"/>
           </w:tcPr>
           <w:p>
-            <w:pPr>
-              <w:spacing w:after="0" w:line="276" w:lineRule="auto"/>
-            </w:pPr>
-            <w:r>
-              <w:rPr>
-                <w:rFonts w:ascii="Microsoft YaHei" w:hAnsi="Microsoft YaHei" w:eastAsia="微软雅黑"/>
-                <w:sz w:val="17"/>
-              </w:rPr>
+            <w:r>
               <w:t>候选和弦 组成音 置信度</w:t>
             </w:r>
           </w:p>
@@ -9769,20 +10226,16 @@
             <w:vAlign w:val="center"/>
           </w:tcPr>
           <w:p>
-            <w:pPr>
-              <w:spacing w:after="0" w:line="276" w:lineRule="auto"/>
-            </w:pPr>
-            <w:r>
-              <w:rPr>
-                <w:rFonts w:ascii="Microsoft YaHei" w:hAnsi="Microsoft YaHei" w:eastAsia="微软雅黑"/>
-                <w:sz w:val="17"/>
-              </w:rPr>
-              <w:t>复杂演奏或高噪声时允许无法判断</w:t>
+            <w:r>
+              <w:t>复杂演奏或高噪声时允许无法判断；首期不作为发布门槛</w:t>
             </w:r>
           </w:p>
         </w:tc>
       </w:tr>
       <w:tr>
+        <w:trPr>
+          <w:cantSplit/>
+        </w:trPr>
         <w:tc>
           <w:tcPr>
             <w:tcW w:type="dxa" w:w="1701"/>
@@ -9886,6 +10339,9 @@
         </w:tc>
       </w:tr>
       <w:tr>
+        <w:trPr>
+          <w:cantSplit/>
+        </w:trPr>
         <w:tc>
           <w:tcPr>
             <w:tcW w:type="dxa" w:w="1701"/>
@@ -9985,6 +10441,9 @@
         </w:tc>
       </w:tr>
       <w:tr>
+        <w:trPr>
+          <w:cantSplit/>
+        </w:trPr>
         <w:tc>
           <w:tcPr>
             <w:tcW w:type="dxa" w:w="1701"/>
@@ -10113,7 +10572,7 @@
         <w:rPr>
           <w:rFonts w:ascii="Microsoft YaHei" w:hAnsi="Microsoft YaHei" w:eastAsia="微软雅黑"/>
         </w:rPr>
-        <w:t>每条识别结果必须包含时间戳、置信度、算法版本和输入质量信息。</w:t>
+        <w:t>每条识别结果必须包含时间戳、置信度、算法版本、输入质量和内部设备能力档位信息；设备档位只用于测试、灰度和问题定位，不作为面向用户的能力排名。</w:t>
       </w:r>
     </w:p>
     <w:p>
@@ -10150,6 +10609,15 @@
           <w:rFonts w:ascii="Microsoft YaHei" w:hAnsi="Microsoft YaHei" w:eastAsia="微软雅黑"/>
         </w:rPr>
         <w:t>姿势与指法建议必须来自明确的乐器规则或审核内容；仅凭音高异常不得推断身体动作。</w:t>
+      </w:r>
+    </w:p>
+    <w:p>
+      <w:pPr>
+        <w:pStyle w:val="ListBullet"/>
+      </w:pPr>
+      <w:r>
+        <w:rPr/>
+        <w:t>每项算法必须按乐器、音域、浏览器、内部设备能力档位、环境噪声和演奏方式分别评测，不以总体平均值代替分组结果。</w:t>
       </w:r>
     </w:p>
     <w:p>
@@ -10198,6 +10666,7 @@
       <w:tr>
         <w:trPr>
           <w:tblHeader w:val="true"/>
+          <w:cantSplit/>
         </w:trPr>
         <w:tc>
           <w:tcPr>
@@ -10239,17 +10708,8 @@
             <w:vAlign w:val="center"/>
           </w:tcPr>
           <w:p>
-            <w:pPr>
-              <w:jc w:val="center"/>
-            </w:pPr>
-            <w:r>
-              <w:rPr>
-                <w:rFonts w:ascii="Microsoft YaHei" w:hAnsi="Microsoft YaHei" w:eastAsia="微软雅黑"/>
-                <w:b/>
-                <w:color w:val="FFFFFF"/>
-                <w:sz w:val="18"/>
-              </w:rPr>
-              <w:t>目标</w:t>
+            <w:r>
+              <w:t>阶段零技术目标</w:t>
             </w:r>
           </w:p>
         </w:tc>
@@ -10266,22 +10726,16 @@
             <w:vAlign w:val="center"/>
           </w:tcPr>
           <w:p>
-            <w:pPr>
-              <w:jc w:val="center"/>
-            </w:pPr>
-            <w:r>
-              <w:rPr>
-                <w:rFonts w:ascii="Microsoft YaHei" w:hAnsi="Microsoft YaHei" w:eastAsia="微软雅黑"/>
-                <w:b/>
-                <w:color w:val="FFFFFF"/>
-                <w:sz w:val="18"/>
-              </w:rPr>
-              <w:t>测量条件</w:t>
+            <w:r>
+              <w:t>测量条件与处理方式</w:t>
             </w:r>
           </w:p>
         </w:tc>
       </w:tr>
       <w:tr>
+        <w:trPr>
+          <w:cantSplit/>
+        </w:trPr>
         <w:tc>
           <w:tcPr>
             <w:tcW w:type="dxa" w:w="2268"/>
@@ -10319,15 +10773,8 @@
             <w:vAlign w:val="center"/>
           </w:tcPr>
           <w:p>
-            <w:pPr>
-              <w:spacing w:after="0" w:line="276" w:lineRule="auto"/>
-            </w:pPr>
-            <w:r>
-              <w:rPr>
-                <w:rFonts w:ascii="Microsoft YaHei" w:hAnsi="Microsoft YaHei" w:eastAsia="微软雅黑"/>
-                <w:sz w:val="17"/>
-              </w:rPr>
-              <w:t>P95 小于 150ms</w:t>
+            <w:r>
+              <w:t>受控条件下 P95 小于 150ms，并记录 P50</w:t>
             </w:r>
           </w:p>
         </w:tc>
@@ -10343,20 +10790,16 @@
             <w:vAlign w:val="center"/>
           </w:tcPr>
           <w:p>
-            <w:pPr>
-              <w:spacing w:after="0" w:line="276" w:lineRule="auto"/>
-            </w:pPr>
-            <w:r>
-              <w:rPr>
-                <w:rFonts w:ascii="Microsoft YaHei" w:hAnsi="Microsoft YaHei" w:eastAsia="微软雅黑"/>
-                <w:sz w:val="17"/>
-              </w:rPr>
-              <w:t>支持设备 安静环境 实时单音练习</w:t>
+            <w:r>
+              <w:t>通过内部能力检测的设备、前台页面、安静环境、实时单音练习；PoC 后冻结正式发布门槛</w:t>
             </w:r>
           </w:p>
         </w:tc>
       </w:tr>
       <w:tr>
+        <w:trPr>
+          <w:cantSplit/>
+        </w:trPr>
         <w:tc>
           <w:tcPr>
             <w:tcW w:type="dxa" w:w="2268"/>
@@ -10396,15 +10839,8 @@
             <w:vAlign w:val="center"/>
           </w:tcPr>
           <w:p>
-            <w:pPr>
-              <w:spacing w:after="0" w:line="276" w:lineRule="auto"/>
-            </w:pPr>
-            <w:r>
-              <w:rPr>
-                <w:rFonts w:ascii="Microsoft YaHei" w:hAnsi="Microsoft YaHei" w:eastAsia="微软雅黑"/>
-                <w:sz w:val="17"/>
-              </w:rPr>
-              <w:t>不低于 95%</w:t>
+            <w:r>
+              <w:t>受控条件下不低于 95%</w:t>
             </w:r>
           </w:p>
         </w:tc>
@@ -10421,20 +10857,16 @@
             <w:vAlign w:val="center"/>
           </w:tcPr>
           <w:p>
-            <w:pPr>
-              <w:spacing w:after="0" w:line="276" w:lineRule="auto"/>
-            </w:pPr>
-            <w:r>
-              <w:rPr>
-                <w:rFonts w:ascii="Microsoft YaHei" w:hAnsi="Microsoft YaHei" w:eastAsia="微软雅黑"/>
-                <w:sz w:val="17"/>
-              </w:rPr>
-              <w:t>环境噪声低于 40dB 支持音域与乐器测试集</w:t>
+            <w:r>
+              <w:t>钢琴和小提琴分别统计，限定支持音域、输入质量和内部设备能力档位；同时报告覆盖率与误判率</w:t>
             </w:r>
           </w:p>
         </w:tc>
       </w:tr>
       <w:tr>
+        <w:trPr>
+          <w:cantSplit/>
+        </w:trPr>
         <w:tc>
           <w:tcPr>
             <w:tcW w:type="dxa" w:w="2268"/>
@@ -10472,15 +10904,8 @@
             <w:vAlign w:val="center"/>
           </w:tcPr>
           <w:p>
-            <w:pPr>
-              <w:spacing w:after="0" w:line="276" w:lineRule="auto"/>
-            </w:pPr>
-            <w:r>
-              <w:rPr>
-                <w:rFonts w:ascii="Microsoft YaHei" w:hAnsi="Microsoft YaHei" w:eastAsia="微软雅黑"/>
-                <w:sz w:val="17"/>
-              </w:rPr>
-              <w:t>不低于 85%</w:t>
+            <w:r>
+              <w:t>验证目标不低于 85%，不作为首期发布门槛</w:t>
             </w:r>
           </w:p>
         </w:tc>
@@ -10496,20 +10921,16 @@
             <w:vAlign w:val="center"/>
           </w:tcPr>
           <w:p>
-            <w:pPr>
-              <w:spacing w:after="0" w:line="276" w:lineRule="auto"/>
-            </w:pPr>
-            <w:r>
-              <w:rPr>
-                <w:rFonts w:ascii="Microsoft YaHei" w:hAnsi="Microsoft YaHei" w:eastAsia="微软雅黑"/>
-                <w:sz w:val="17"/>
-              </w:rPr>
-              <w:t>审核通过的基础和弦 稳定发声片段</w:t>
+            <w:r>
+              <w:t>审核通过的吉他基础和弦、稳定发声片段和限定设备条件；验证通过后独立灰度</w:t>
             </w:r>
           </w:p>
         </w:tc>
       </w:tr>
       <w:tr>
+        <w:trPr>
+          <w:cantSplit/>
+        </w:trPr>
         <w:tc>
           <w:tcPr>
             <w:tcW w:type="dxa" w:w="2268"/>
@@ -10549,15 +10970,8 @@
             <w:vAlign w:val="center"/>
           </w:tcPr>
           <w:p>
-            <w:pPr>
-              <w:spacing w:after="0" w:line="276" w:lineRule="auto"/>
-            </w:pPr>
-            <w:r>
-              <w:rPr>
-                <w:rFonts w:ascii="Microsoft YaHei" w:hAnsi="Microsoft YaHei" w:eastAsia="微软雅黑"/>
-                <w:sz w:val="17"/>
-              </w:rPr>
-              <w:t>不高于评审确定阈值</w:t>
+            <w:r>
+              <w:t>PoC 建立基线后确定正式阈值</w:t>
             </w:r>
           </w:p>
         </w:tc>
@@ -10574,20 +10988,16 @@
             <w:vAlign w:val="center"/>
           </w:tcPr>
           <w:p>
-            <w:pPr>
-              <w:spacing w:after="0" w:line="276" w:lineRule="auto"/>
-            </w:pPr>
-            <w:r>
-              <w:rPr>
-                <w:rFonts w:ascii="Microsoft YaHei" w:hAnsi="Microsoft YaHei" w:eastAsia="微软雅黑"/>
-                <w:sz w:val="17"/>
-              </w:rPr>
-              <w:t>噪声 弱输入 泛音和非目标声音测试集</w:t>
+            <w:r>
+              <w:t>按噪声、弱输入、泛音和非目标声音分组，同时报告无法判断率</w:t>
             </w:r>
           </w:p>
         </w:tc>
       </w:tr>
       <w:tr>
+        <w:trPr>
+          <w:cantSplit/>
+        </w:trPr>
         <w:tc>
           <w:tcPr>
             <w:tcW w:type="dxa" w:w="2268"/>
@@ -10625,15 +11035,8 @@
             <w:vAlign w:val="center"/>
           </w:tcPr>
           <w:p>
-            <w:pPr>
-              <w:spacing w:after="0" w:line="276" w:lineRule="auto"/>
-            </w:pPr>
-            <w:r>
-              <w:rPr>
-                <w:rFonts w:ascii="Microsoft YaHei" w:hAnsi="Microsoft YaHei" w:eastAsia="微软雅黑"/>
-                <w:sz w:val="17"/>
-              </w:rPr>
-              <w:t>不低于 99%</w:t>
+            <w:r>
+              <w:t>服务可用且输入合规时不低于 99%</w:t>
             </w:r>
           </w:p>
         </w:tc>
@@ -10649,15 +11052,8 @@
             <w:vAlign w:val="center"/>
           </w:tcPr>
           <w:p>
-            <w:pPr>
-              <w:spacing w:after="0" w:line="276" w:lineRule="auto"/>
-            </w:pPr>
-            <w:r>
-              <w:rPr>
-                <w:rFonts w:ascii="Microsoft YaHei" w:hAnsi="Microsoft YaHei" w:eastAsia="微软雅黑"/>
-                <w:sz w:val="17"/>
-              </w:rPr>
-              <w:t>服务可用且输入音频符合要求</w:t>
+            <w:r>
+              <w:t>区分实时报告、降级分析和录音导入任务，并记录重试与积压</w:t>
             </w:r>
           </w:p>
         </w:tc>
@@ -10673,7 +11069,7 @@
         <w:rPr>
           <w:rFonts w:ascii="Microsoft YaHei" w:hAnsi="Microsoft YaHei" w:eastAsia="微软雅黑"/>
         </w:rPr>
-        <w:t>以上为首轮验收目标。正式发布前应按乐器、设备、音域、环境噪声和演奏方式拆分测试结果，不得只报告总体平均值。</w:t>
+        <w:t>以上为阶段零技术目标，不构成所有设备和环境下的统一 SLA。阶段零完成后，根据钢琴与小提琴的分组结果冻结阶段一正式发布门槛。正式评审必须同时报告准确率、有效识别覆盖率、误判率、无法判断率以及端到端 P50 和 P95 延迟。</w:t>
       </w:r>
     </w:p>
     <w:p>
@@ -10780,6 +11176,7 @@
       <w:tr>
         <w:trPr>
           <w:tblHeader w:val="true"/>
+          <w:cantSplit/>
         </w:trPr>
         <w:tc>
           <w:tcPr>
@@ -10864,6 +11261,9 @@
         </w:tc>
       </w:tr>
       <w:tr>
+        <w:trPr>
+          <w:cantSplit/>
+        </w:trPr>
         <w:tc>
           <w:tcPr>
             <w:tcW w:type="dxa" w:w="1701"/>
@@ -10939,6 +11339,9 @@
         </w:tc>
       </w:tr>
       <w:tr>
+        <w:trPr>
+          <w:cantSplit/>
+        </w:trPr>
         <w:tc>
           <w:tcPr>
             <w:tcW w:type="dxa" w:w="1701"/>
@@ -11017,6 +11420,9 @@
         </w:tc>
       </w:tr>
       <w:tr>
+        <w:trPr>
+          <w:cantSplit/>
+        </w:trPr>
         <w:tc>
           <w:tcPr>
             <w:tcW w:type="dxa" w:w="1701"/>
@@ -11092,6 +11498,9 @@
         </w:tc>
       </w:tr>
       <w:tr>
+        <w:trPr>
+          <w:cantSplit/>
+        </w:trPr>
         <w:tc>
           <w:tcPr>
             <w:tcW w:type="dxa" w:w="1701"/>
@@ -11170,6 +11579,9 @@
         </w:tc>
       </w:tr>
       <w:tr>
+        <w:trPr>
+          <w:cantSplit/>
+        </w:trPr>
         <w:tc>
           <w:tcPr>
             <w:tcW w:type="dxa" w:w="1701"/>
@@ -11245,6 +11657,9 @@
         </w:tc>
       </w:tr>
       <w:tr>
+        <w:trPr>
+          <w:cantSplit/>
+        </w:trPr>
         <w:tc>
           <w:tcPr>
             <w:tcW w:type="dxa" w:w="1701"/>
@@ -11323,6 +11738,9 @@
         </w:tc>
       </w:tr>
       <w:tr>
+        <w:trPr>
+          <w:cantSplit/>
+        </w:trPr>
         <w:tc>
           <w:tcPr>
             <w:tcW w:type="dxa" w:w="1701"/>
@@ -11437,6 +11855,7 @@
       <w:tr>
         <w:trPr>
           <w:tblHeader w:val="true"/>
+          <w:cantSplit/>
         </w:trPr>
         <w:tc>
           <w:tcPr>
@@ -11521,6 +11940,9 @@
         </w:tc>
       </w:tr>
       <w:tr>
+        <w:trPr>
+          <w:cantSplit/>
+        </w:trPr>
         <w:tc>
           <w:tcPr>
             <w:tcW w:type="dxa" w:w="2268"/>
@@ -11596,6 +12018,9 @@
         </w:tc>
       </w:tr>
       <w:tr>
+        <w:trPr>
+          <w:cantSplit/>
+        </w:trPr>
         <w:tc>
           <w:tcPr>
             <w:tcW w:type="dxa" w:w="2268"/>
@@ -11674,6 +12099,9 @@
         </w:tc>
       </w:tr>
       <w:tr>
+        <w:trPr>
+          <w:cantSplit/>
+        </w:trPr>
         <w:tc>
           <w:tcPr>
             <w:tcW w:type="dxa" w:w="2268"/>
@@ -11749,6 +12177,9 @@
         </w:tc>
       </w:tr>
       <w:tr>
+        <w:trPr>
+          <w:cantSplit/>
+        </w:trPr>
         <w:tc>
           <w:tcPr>
             <w:tcW w:type="dxa" w:w="2268"/>
@@ -11827,6 +12258,9 @@
         </w:tc>
       </w:tr>
       <w:tr>
+        <w:trPr>
+          <w:cantSplit/>
+        </w:trPr>
         <w:tc>
           <w:tcPr>
             <w:tcW w:type="dxa" w:w="2268"/>
@@ -11902,6 +12336,9 @@
         </w:tc>
       </w:tr>
       <w:tr>
+        <w:trPr>
+          <w:cantSplit/>
+        </w:trPr>
         <w:tc>
           <w:tcPr>
             <w:tcW w:type="dxa" w:w="2268"/>
@@ -12017,6 +12454,15 @@
           <w:rFonts w:ascii="Microsoft YaHei" w:hAnsi="Microsoft YaHei" w:eastAsia="微软雅黑"/>
         </w:rPr>
         <w:t>练习准确率必须同时展示有效识别覆盖率，避免通过忽略困难片段提高分数。</w:t>
+      </w:r>
+    </w:p>
+    <w:p>
+      <w:pPr>
+        <w:pStyle w:val="ListBullet"/>
+      </w:pPr>
+      <w:r>
+        <w:rPr/>
+        <w:t>算法质量看板按乐器、练习类型、浏览器、内部设备能力档位、算法版本和输入质量拆分，不以跨条件汇总均值作为放量依据。</w:t>
       </w:r>
     </w:p>
     <w:p>
@@ -12064,6 +12510,7 @@
       <w:tr>
         <w:trPr>
           <w:tblHeader w:val="true"/>
+          <w:cantSplit/>
         </w:trPr>
         <w:tc>
           <w:tcPr>
@@ -12121,6 +12568,9 @@
         </w:tc>
       </w:tr>
       <w:tr>
+        <w:trPr>
+          <w:cantSplit/>
+        </w:trPr>
         <w:tc>
           <w:tcPr>
             <w:tcW w:type="dxa" w:w="1984"/>
@@ -12158,20 +12608,16 @@
             <w:vAlign w:val="center"/>
           </w:tcPr>
           <w:p>
-            <w:pPr>
-              <w:spacing w:after="0" w:line="276" w:lineRule="auto"/>
-            </w:pPr>
-            <w:r>
-              <w:rPr>
-                <w:rFonts w:ascii="Microsoft YaHei" w:hAnsi="Microsoft YaHei" w:eastAsia="微软雅黑"/>
-                <w:sz w:val="17"/>
-              </w:rPr>
-              <w:t>练习页首屏与音频能力加载时间按网络等级监控；实时反馈达到第 7.3 节目标。</w:t>
+            <w:r>
+              <w:t>练习页首屏与音频能力加载时间按网络和内部设备能力档位监控；实时反馈目标按第 7.3 节受控条件测量，不能满足条件时进入降级状态。</w:t>
             </w:r>
           </w:p>
         </w:tc>
       </w:tr>
       <w:tr>
+        <w:trPr>
+          <w:cantSplit/>
+        </w:trPr>
         <w:tc>
           <w:tcPr>
             <w:tcW w:type="dxa" w:w="1984"/>
@@ -12225,6 +12671,9 @@
         </w:tc>
       </w:tr>
       <w:tr>
+        <w:trPr>
+          <w:cantSplit/>
+        </w:trPr>
         <w:tc>
           <w:tcPr>
             <w:tcW w:type="dxa" w:w="1984"/>
@@ -12262,20 +12711,16 @@
             <w:vAlign w:val="center"/>
           </w:tcPr>
           <w:p>
-            <w:pPr>
-              <w:spacing w:after="0" w:line="276" w:lineRule="auto"/>
-            </w:pPr>
-            <w:r>
-              <w:rPr>
-                <w:rFonts w:ascii="Microsoft YaHei" w:hAnsi="Microsoft YaHei" w:eastAsia="微软雅黑"/>
-                <w:sz w:val="17"/>
-              </w:rPr>
-              <w:t>初步设计不按具体设备型号拆分规则；优先支持主流现代浏览器，并在测试阶段记录明显兼容问题。</w:t>
+            <w:r>
+              <w:t>优先支持具备安全上下文、麦克风采集和低延迟音频处理能力的主流现代浏览器。用户侧不展示设备等级；测试、灰度和验收按内部能力档位拆分。</w:t>
             </w:r>
           </w:p>
         </w:tc>
       </w:tr>
       <w:tr>
+        <w:trPr>
+          <w:cantSplit/>
+        </w:trPr>
         <w:tc>
           <w:tcPr>
             <w:tcW w:type="dxa" w:w="1984"/>
@@ -12329,6 +12774,9 @@
         </w:tc>
       </w:tr>
       <w:tr>
+        <w:trPr>
+          <w:cantSplit/>
+        </w:trPr>
         <w:tc>
           <w:tcPr>
             <w:tcW w:type="dxa" w:w="1984"/>
@@ -12366,20 +12814,16 @@
             <w:vAlign w:val="center"/>
           </w:tcPr>
           <w:p>
-            <w:pPr>
-              <w:spacing w:after="0" w:line="276" w:lineRule="auto"/>
-            </w:pPr>
-            <w:r>
-              <w:rPr>
-                <w:rFonts w:ascii="Microsoft YaHei" w:hAnsi="Microsoft YaHei" w:eastAsia="微软雅黑"/>
-                <w:sz w:val="17"/>
-              </w:rPr>
-              <w:t>连续练习场景监控耗电、温升和降频；超过阈值时降低动画或分析频率。</w:t>
+            <w:r>
+              <w:t>连续练习场景监控 CPU、内存、耗电、温升和降频；超过阈值时降低动画或分析频率，持续不足时停止实时评分并转为降级分析。</w:t>
             </w:r>
           </w:p>
         </w:tc>
       </w:tr>
       <w:tr>
+        <w:trPr>
+          <w:cantSplit/>
+        </w:trPr>
         <w:tc>
           <w:tcPr>
             <w:tcW w:type="dxa" w:w="1984"/>
@@ -12419,20 +12863,16 @@
             <w:vAlign w:val="center"/>
           </w:tcPr>
           <w:p>
-            <w:pPr>
-              <w:spacing w:after="0" w:line="276" w:lineRule="auto"/>
-            </w:pPr>
-            <w:r>
-              <w:rPr>
-                <w:rFonts w:ascii="Microsoft YaHei" w:hAnsi="Microsoft YaHei" w:eastAsia="微软雅黑"/>
-                <w:sz w:val="17"/>
-              </w:rPr>
-              <w:t>Web 首屏只加载必要资源，课程音频、曲目和模型文件按需加载；浏览器缓存可更新并可清理。</w:t>
+            <w:r>
+              <w:t>Web 首屏只加载必要资源，课程音频、曲目和模型文件按需加载；模型与浏览器缓存必须带版本，可更新、可回滚并允许用户清理。</w:t>
             </w:r>
           </w:p>
         </w:tc>
       </w:tr>
       <w:tr>
+        <w:trPr>
+          <w:cantSplit/>
+        </w:trPr>
         <w:tc>
           <w:tcPr>
             <w:tcW w:type="dxa" w:w="1984"/>
@@ -12484,6 +12924,9 @@
         </w:tc>
       </w:tr>
       <w:tr>
+        <w:trPr>
+          <w:cantSplit/>
+        </w:trPr>
         <w:tc>
           <w:tcPr>
             <w:tcW w:type="dxa" w:w="1984"/>
@@ -12594,6 +13037,7 @@
       <w:tr>
         <w:trPr>
           <w:tblHeader w:val="true"/>
+          <w:cantSplit/>
         </w:trPr>
         <w:tc>
           <w:tcPr>
@@ -12651,6 +13095,9 @@
         </w:tc>
       </w:tr>
       <w:tr>
+        <w:trPr>
+          <w:cantSplit/>
+        </w:trPr>
         <w:tc>
           <w:tcPr>
             <w:tcW w:type="dxa" w:w="2268"/>
@@ -12702,6 +13149,9 @@
         </w:tc>
       </w:tr>
       <w:tr>
+        <w:trPr>
+          <w:cantSplit/>
+        </w:trPr>
         <w:tc>
           <w:tcPr>
             <w:tcW w:type="dxa" w:w="2268"/>
@@ -12755,6 +13205,9 @@
         </w:tc>
       </w:tr>
       <w:tr>
+        <w:trPr>
+          <w:cantSplit/>
+        </w:trPr>
         <w:tc>
           <w:tcPr>
             <w:tcW w:type="dxa" w:w="2268"/>
@@ -12806,6 +13259,9 @@
         </w:tc>
       </w:tr>
       <w:tr>
+        <w:trPr>
+          <w:cantSplit/>
+        </w:trPr>
         <w:tc>
           <w:tcPr>
             <w:tcW w:type="dxa" w:w="2268"/>
@@ -12859,6 +13315,9 @@
         </w:tc>
       </w:tr>
       <w:tr>
+        <w:trPr>
+          <w:cantSplit/>
+        </w:trPr>
         <w:tc>
           <w:tcPr>
             <w:tcW w:type="dxa" w:w="2268"/>
@@ -12920,9 +13379,233 @@
         <w:rPr>
           <w:rFonts w:ascii="Microsoft YaHei" w:hAnsi="Microsoft YaHei" w:eastAsia="微软雅黑"/>
         </w:rPr>
-        <w:t>Web 端与服务端通过加密连接通信。实时识别可以根据技术验证结果采用浏览器端处理、服务端流式处理或两者结合，但对用户展示的状态、错误处理和隐私规则保持一致。</w:t>
+        <w:t>Web 端与服务端通过 HTTPS 加密连接通信。实时识别根据阶段零结果采用浏览器端处理、服务端流式处理或两者结合。AudioWorklet、WASM 或同等低延迟能力不可用时，不得静默切换为低质量实时评分，应进入降级分析或设备不支持状态；用户状态、错误处理和隐私规则保持一致。</w:t>
       </w:r>
     </w:p>
+    <w:p>
+      <w:pPr>
+        <w:pStyle w:val="Heading2"/>
+      </w:pPr>
+      <w:r>
+        <w:rPr/>
+        <w:t>9.3 内部设备能力与降级</w:t>
+      </w:r>
+    </w:p>
+    <w:tbl>
+      <w:tblPr>
+        <w:tblW w:type="auto" w:w="0"/>
+        <w:jc w:val="center"/>
+        <w:tblLayout w:type="fixed"/>
+        <w:tblLook w:firstColumn="1" w:firstRow="1" w:lastColumn="0" w:lastRow="0" w:noHBand="0" w:noVBand="1" w:val="04A0"/>
+        <w:tblBorders>
+          <w:top w:val="single" w:sz="5" w:color="D9D9D9"/>
+          <w:left w:val="single" w:sz="5" w:color="D9D9D9"/>
+          <w:bottom w:val="single" w:sz="5" w:color="D9D9D9"/>
+          <w:right w:val="single" w:sz="5" w:color="D9D9D9"/>
+          <w:insideH w:val="single" w:sz="5" w:color="D9D9D9"/>
+          <w:insideV w:val="single" w:sz="5" w:color="D9D9D9"/>
+        </w:tblBorders>
+      </w:tblPr>
+      <w:tblGrid>
+        <w:gridCol w:w="4759"/>
+        <w:gridCol w:w="4759"/>
+      </w:tblGrid>
+      <w:tr>
+        <w:trPr>
+          <w:cantSplit/>
+        </w:trPr>
+        <w:tc>
+          <w:tcPr>
+            <w:tcW w:type="dxa" w:w="1984"/>
+            <w:tcMar>
+              <w:top w:w="100" w:type="dxa"/>
+              <w:start w:w="120" w:type="dxa"/>
+              <w:bottom w:w="100" w:type="dxa"/>
+              <w:end w:w="120" w:type="dxa"/>
+            </w:tcMar>
+            <w:vAlign w:val="center"/>
+          </w:tcPr>
+          <w:p>
+            <w:r>
+              <w:t>能力状态</w:t>
+            </w:r>
+          </w:p>
+        </w:tc>
+        <w:tc>
+          <w:tcPr>
+            <w:tcW w:type="dxa" w:w="6803"/>
+            <w:tcMar>
+              <w:top w:w="100" w:type="dxa"/>
+              <w:start w:w="120" w:type="dxa"/>
+              <w:bottom w:w="100" w:type="dxa"/>
+              <w:end w:w="120" w:type="dxa"/>
+            </w:tcMar>
+            <w:vAlign w:val="center"/>
+          </w:tcPr>
+          <w:p>
+            <w:r>
+              <w:t>判定与产品行为</w:t>
+            </w:r>
+          </w:p>
+        </w:tc>
+      </w:tr>
+      <w:tr>
+        <w:trPr>
+          <w:cantSplit/>
+        </w:trPr>
+        <w:tc>
+          <w:tcPr>
+            <w:tcW w:type="dxa" w:w="1984"/>
+            <w:tcMar>
+              <w:top w:w="100" w:type="dxa"/>
+              <w:start w:w="120" w:type="dxa"/>
+              <w:bottom w:w="100" w:type="dxa"/>
+              <w:end w:w="120" w:type="dxa"/>
+            </w:tcMar>
+            <w:vAlign w:val="center"/>
+          </w:tcPr>
+          <w:p>
+            <w:r>
+              <w:t>可评分</w:t>
+            </w:r>
+          </w:p>
+        </w:tc>
+        <w:tc>
+          <w:tcPr>
+            <w:tcW w:type="dxa" w:w="6803"/>
+            <w:tcMar>
+              <w:top w:w="100" w:type="dxa"/>
+              <w:start w:w="120" w:type="dxa"/>
+              <w:bottom w:w="100" w:type="dxa"/>
+              <w:end w:w="120" w:type="dxa"/>
+            </w:tcMar>
+            <w:vAlign w:val="center"/>
+          </w:tcPr>
+          <w:p>
+            <w:r>
+              <w:t>安全上下文、音频能力、采集质量和性能达到当前乐器的评分门槛，允许实时反馈</w:t>
+            </w:r>
+          </w:p>
+        </w:tc>
+      </w:tr>
+      <w:tr>
+        <w:trPr>
+          <w:cantSplit/>
+        </w:trPr>
+        <w:tc>
+          <w:tcPr>
+            <w:tcW w:type="dxa" w:w="1984"/>
+            <w:tcMar>
+              <w:top w:w="100" w:type="dxa"/>
+              <w:start w:w="120" w:type="dxa"/>
+              <w:bottom w:w="100" w:type="dxa"/>
+              <w:end w:w="120" w:type="dxa"/>
+            </w:tcMar>
+            <w:vAlign w:val="center"/>
+          </w:tcPr>
+          <w:p>
+            <w:r>
+              <w:t>低置信度无法判断</w:t>
+            </w:r>
+          </w:p>
+        </w:tc>
+        <w:tc>
+          <w:tcPr>
+            <w:tcW w:type="dxa" w:w="6803"/>
+            <w:tcMar>
+              <w:top w:w="100" w:type="dxa"/>
+              <w:start w:w="120" w:type="dxa"/>
+              <w:bottom w:w="100" w:type="dxa"/>
+              <w:end w:w="120" w:type="dxa"/>
+            </w:tcMar>
+            <w:vAlign w:val="center"/>
+          </w:tcPr>
+          <w:p>
+            <w:r>
+              <w:t>设备能力可用但当前输入证据不足，不计入错音或准确率分母</w:t>
+            </w:r>
+          </w:p>
+        </w:tc>
+      </w:tr>
+      <w:tr>
+        <w:trPr>
+          <w:cantSplit/>
+        </w:trPr>
+        <w:tc>
+          <w:tcPr>
+            <w:tcW w:type="dxa" w:w="1984"/>
+            <w:tcMar>
+              <w:top w:w="100" w:type="dxa"/>
+              <w:start w:w="120" w:type="dxa"/>
+              <w:bottom w:w="100" w:type="dxa"/>
+              <w:end w:w="120" w:type="dxa"/>
+            </w:tcMar>
+            <w:vAlign w:val="center"/>
+          </w:tcPr>
+          <w:p>
+            <w:r>
+              <w:t>降级分析</w:t>
+            </w:r>
+          </w:p>
+        </w:tc>
+        <w:tc>
+          <w:tcPr>
+            <w:tcW w:type="dxa" w:w="6803"/>
+            <w:tcMar>
+              <w:top w:w="100" w:type="dxa"/>
+              <w:start w:w="120" w:type="dxa"/>
+              <w:bottom w:w="100" w:type="dxa"/>
+              <w:end w:w="120" w:type="dxa"/>
+            </w:tcMar>
+            <w:vAlign w:val="center"/>
+          </w:tcPr>
+          <w:p>
+            <w:r>
+              <w:t>实时链路不满足稳定性要求但允许采集，完成后进行录音分析并明确处理方式</w:t>
+            </w:r>
+          </w:p>
+        </w:tc>
+      </w:tr>
+      <w:tr>
+        <w:trPr>
+          <w:cantSplit/>
+        </w:trPr>
+        <w:tc>
+          <w:tcPr>
+            <w:tcW w:type="dxa" w:w="1984"/>
+            <w:tcMar>
+              <w:top w:w="100" w:type="dxa"/>
+              <w:start w:w="120" w:type="dxa"/>
+              <w:bottom w:w="100" w:type="dxa"/>
+              <w:end w:w="120" w:type="dxa"/>
+            </w:tcMar>
+            <w:vAlign w:val="center"/>
+          </w:tcPr>
+          <w:p>
+            <w:r>
+              <w:t>设备不支持</w:t>
+            </w:r>
+          </w:p>
+        </w:tc>
+        <w:tc>
+          <w:tcPr>
+            <w:tcW w:type="dxa" w:w="6803"/>
+            <w:tcMar>
+              <w:top w:w="100" w:type="dxa"/>
+              <w:start w:w="120" w:type="dxa"/>
+              <w:bottom w:w="100" w:type="dxa"/>
+              <w:end w:w="120" w:type="dxa"/>
+            </w:tcMar>
+            <w:vAlign w:val="center"/>
+          </w:tcPr>
+          <w:p>
+            <w:r>
+              <w:t>缺少必要浏览器能力或持续性能不足，不启动实时评分，提供非评分练习入口</w:t>
+            </w:r>
+          </w:p>
+        </w:tc>
+      </w:tr>
+    </w:tbl>
     <w:p>
       <w:pPr>
         <w:pStyle w:val="Heading1"/>
@@ -12956,6 +13639,7 @@
       <w:tr>
         <w:trPr>
           <w:tblHeader w:val="true"/>
+          <w:cantSplit/>
         </w:trPr>
         <w:tc>
           <w:tcPr>
@@ -13013,6 +13697,9 @@
         </w:tc>
       </w:tr>
       <w:tr>
+        <w:trPr>
+          <w:cantSplit/>
+        </w:trPr>
         <w:tc>
           <w:tcPr>
             <w:tcW w:type="dxa" w:w="1984"/>
@@ -13064,6 +13751,9 @@
         </w:tc>
       </w:tr>
       <w:tr>
+        <w:trPr>
+          <w:cantSplit/>
+        </w:trPr>
         <w:tc>
           <w:tcPr>
             <w:tcW w:type="dxa" w:w="1984"/>
@@ -13103,20 +13793,16 @@
             <w:vAlign w:val="center"/>
           </w:tcPr>
           <w:p>
-            <w:pPr>
-              <w:spacing w:after="0" w:line="276" w:lineRule="auto"/>
-            </w:pPr>
-            <w:r>
-              <w:rPr>
-                <w:rFonts w:ascii="Microsoft YaHei" w:hAnsi="Microsoft YaHei" w:eastAsia="微软雅黑"/>
-                <w:sz w:val="17"/>
-              </w:rPr>
-              <w:t>默认仅保存完成反馈所需的数据；长期保存必须单独开关并说明期限。</w:t>
+            <w:r>
+              <w:t>长期保存使用独立开关，说明保存目的、期限和删除方式；不得因同意一次练习处理而默认长期保存。</w:t>
             </w:r>
           </w:p>
         </w:tc>
       </w:tr>
       <w:tr>
+        <w:trPr>
+          <w:cantSplit/>
+        </w:trPr>
         <w:tc>
           <w:tcPr>
             <w:tcW w:type="dxa" w:w="1984"/>
@@ -13154,20 +13840,16 @@
             <w:vAlign w:val="center"/>
           </w:tcPr>
           <w:p>
-            <w:pPr>
-              <w:spacing w:after="0" w:line="276" w:lineRule="auto"/>
-            </w:pPr>
-            <w:r>
-              <w:rPr>
-                <w:rFonts w:ascii="Microsoft YaHei" w:hAnsi="Microsoft YaHei" w:eastAsia="微软雅黑"/>
-                <w:sz w:val="17"/>
-              </w:rPr>
-              <w:t>上传前说明处理方式；传输和存储使用加密；任务结束后按策略删除。</w:t>
+            <w:r>
+              <w:t>上传前单独说明处理方式与期限；传输和存储使用加密；任务结束后按策略删除，录音处理授权不等同于模型训练授权。</w:t>
             </w:r>
           </w:p>
         </w:tc>
       </w:tr>
       <w:tr>
+        <w:trPr>
+          <w:cantSplit/>
+        </w:trPr>
         <w:tc>
           <w:tcPr>
             <w:tcW w:type="dxa" w:w="1984"/>
@@ -13221,6 +13903,9 @@
         </w:tc>
       </w:tr>
       <w:tr>
+        <w:trPr>
+          <w:cantSplit/>
+        </w:trPr>
         <w:tc>
           <w:tcPr>
             <w:tcW w:type="dxa" w:w="1984"/>
@@ -13258,20 +13943,16 @@
             <w:vAlign w:val="center"/>
           </w:tcPr>
           <w:p>
-            <w:pPr>
-              <w:spacing w:after="0" w:line="276" w:lineRule="auto"/>
-            </w:pPr>
-            <w:r>
-              <w:rPr>
-                <w:rFonts w:ascii="Microsoft YaHei" w:hAnsi="Microsoft YaHei" w:eastAsia="微软雅黑"/>
-                <w:sz w:val="17"/>
-              </w:rPr>
-              <w:t>用户可删除单条录音、练习历史或全部账户数据，并看到处理结果。</w:t>
+            <w:r>
+              <w:t>用户可删除单条录音、练习历史或全部账户数据；删除必须覆盖业务数据、对象存储、派生报告和可识别缓存，并提供处理状态。</w:t>
             </w:r>
           </w:p>
         </w:tc>
       </w:tr>
       <w:tr>
+        <w:trPr>
+          <w:cantSplit/>
+        </w:trPr>
         <w:tc>
           <w:tcPr>
             <w:tcW w:type="dxa" w:w="1984"/>
@@ -13311,20 +13992,16 @@
             <w:vAlign w:val="center"/>
           </w:tcPr>
           <w:p>
-            <w:pPr>
-              <w:spacing w:after="0" w:line="276" w:lineRule="auto"/>
-            </w:pPr>
-            <w:r>
-              <w:rPr>
-                <w:rFonts w:ascii="Microsoft YaHei" w:hAnsi="Microsoft YaHei" w:eastAsia="微软雅黑"/>
-                <w:sz w:val="17"/>
-              </w:rPr>
-              <w:t>用户数据用于训练或评测前必须取得独立、清晰的授权。</w:t>
+            <w:r>
+              <w:t>用户数据用于训练或评测前必须取得与录音处理、长期保存相分离的独立授权，并支持撤回后停止后续使用。</w:t>
             </w:r>
           </w:p>
         </w:tc>
       </w:tr>
       <w:tr>
+        <w:trPr>
+          <w:cantSplit/>
+        </w:trPr>
         <w:tc>
           <w:tcPr>
             <w:tcW w:type="dxa" w:w="1984"/>
@@ -13376,6 +14053,9 @@
         </w:tc>
       </w:tr>
       <w:tr>
+        <w:trPr>
+          <w:cantSplit/>
+        </w:trPr>
         <w:tc>
           <w:tcPr>
             <w:tcW w:type="dxa" w:w="1984"/>
@@ -13467,6 +14147,7 @@
       <w:tr>
         <w:trPr>
           <w:tblHeader w:val="true"/>
+          <w:cantSplit/>
         </w:trPr>
         <w:tc>
           <w:tcPr>
@@ -13524,6 +14205,9 @@
         </w:tc>
       </w:tr>
       <w:tr>
+        <w:trPr>
+          <w:cantSplit/>
+        </w:trPr>
         <w:tc>
           <w:tcPr>
             <w:tcW w:type="dxa" w:w="1984"/>
@@ -13575,6 +14259,9 @@
         </w:tc>
       </w:tr>
       <w:tr>
+        <w:trPr>
+          <w:cantSplit/>
+        </w:trPr>
         <w:tc>
           <w:tcPr>
             <w:tcW w:type="dxa" w:w="1984"/>
@@ -13614,20 +14301,16 @@
             <w:vAlign w:val="center"/>
           </w:tcPr>
           <w:p>
-            <w:pPr>
-              <w:spacing w:after="0" w:line="276" w:lineRule="auto"/>
-            </w:pPr>
-            <w:r>
-              <w:rPr>
-                <w:rFonts w:ascii="Microsoft YaHei" w:hAnsi="Microsoft YaHei" w:eastAsia="微软雅黑"/>
-                <w:sz w:val="17"/>
-              </w:rPr>
-              <w:t>维护权利来源、授权或公版依据、乐器版本、难度、标签、音频与乐谱资源</w:t>
+            <w:r>
+              <w:t>维护权利来源、授权或公版依据、授权期限、MusicXML 版本、适用乐器、难度、标签、音频与乐谱资源</w:t>
             </w:r>
           </w:p>
         </w:tc>
       </w:tr>
       <w:tr>
+        <w:trPr>
+          <w:cantSplit/>
+        </w:trPr>
         <w:tc>
           <w:tcPr>
             <w:tcW w:type="dxa" w:w="1984"/>
@@ -13665,20 +14348,16 @@
             <w:vAlign w:val="center"/>
           </w:tcPr>
           <w:p>
-            <w:pPr>
-              <w:spacing w:after="0" w:line="276" w:lineRule="auto"/>
-            </w:pPr>
-            <w:r>
-              <w:rPr>
-                <w:rFonts w:ascii="Microsoft YaHei" w:hAnsi="Microsoft YaHei" w:eastAsia="微软雅黑"/>
-                <w:sz w:val="17"/>
-              </w:rPr>
-              <w:t>配置目标音符、时间窗、评分规则、提示内容和适用算法版本</w:t>
+            <w:r>
+              <w:t>配置目标音符、时间窗、评分规则、提示内容、适用算法版本、乐器范围和内部设备能力档位</w:t>
             </w:r>
           </w:p>
         </w:tc>
       </w:tr>
       <w:tr>
+        <w:trPr>
+          <w:cantSplit/>
+        </w:trPr>
         <w:tc>
           <w:tcPr>
             <w:tcW w:type="dxa" w:w="1984"/>
@@ -13732,6 +14411,9 @@
         </w:tc>
       </w:tr>
       <w:tr>
+        <w:trPr>
+          <w:cantSplit/>
+        </w:trPr>
         <w:tc>
           <w:tcPr>
             <w:tcW w:type="dxa" w:w="1984"/>
@@ -13783,6 +14465,9 @@
         </w:tc>
       </w:tr>
       <w:tr>
+        <w:trPr>
+          <w:cantSplit/>
+        </w:trPr>
         <w:tc>
           <w:tcPr>
             <w:tcW w:type="dxa" w:w="1984"/>
@@ -13836,6 +14521,9 @@
         </w:tc>
       </w:tr>
       <w:tr>
+        <w:trPr>
+          <w:cantSplit/>
+        </w:trPr>
         <w:tc>
           <w:tcPr>
             <w:tcW w:type="dxa" w:w="1984"/>
@@ -13937,6 +14625,7 @@
       <w:tr>
         <w:trPr>
           <w:tblHeader w:val="true"/>
+          <w:cantSplit/>
         </w:trPr>
         <w:tc>
           <w:tcPr>
@@ -14021,6 +14710,9 @@
         </w:tc>
       </w:tr>
       <w:tr>
+        <w:trPr>
+          <w:cantSplit/>
+        </w:trPr>
         <w:tc>
           <w:tcPr>
             <w:tcW w:type="dxa" w:w="1814"/>
@@ -14096,6 +14788,9 @@
         </w:tc>
       </w:tr>
       <w:tr>
+        <w:trPr>
+          <w:cantSplit/>
+        </w:trPr>
         <w:tc>
           <w:tcPr>
             <w:tcW w:type="dxa" w:w="1814"/>
@@ -14174,6 +14869,9 @@
         </w:tc>
       </w:tr>
       <w:tr>
+        <w:trPr>
+          <w:cantSplit/>
+        </w:trPr>
         <w:tc>
           <w:tcPr>
             <w:tcW w:type="dxa" w:w="1814"/>
@@ -14249,6 +14947,9 @@
         </w:tc>
       </w:tr>
       <w:tr>
+        <w:trPr>
+          <w:cantSplit/>
+        </w:trPr>
         <w:tc>
           <w:tcPr>
             <w:tcW w:type="dxa" w:w="1814"/>
@@ -14327,6 +15028,9 @@
         </w:tc>
       </w:tr>
       <w:tr>
+        <w:trPr>
+          <w:cantSplit/>
+        </w:trPr>
         <w:tc>
           <w:tcPr>
             <w:tcW w:type="dxa" w:w="1814"/>
@@ -14402,6 +15106,9 @@
         </w:tc>
       </w:tr>
       <w:tr>
+        <w:trPr>
+          <w:cantSplit/>
+        </w:trPr>
         <w:tc>
           <w:tcPr>
             <w:tcW w:type="dxa" w:w="1814"/>
@@ -14480,6 +15187,9 @@
         </w:tc>
       </w:tr>
       <w:tr>
+        <w:trPr>
+          <w:cantSplit/>
+        </w:trPr>
         <w:tc>
           <w:tcPr>
             <w:tcW w:type="dxa" w:w="1814"/>
@@ -14555,6 +15265,9 @@
         </w:tc>
       </w:tr>
       <w:tr>
+        <w:trPr>
+          <w:cantSplit/>
+        </w:trPr>
         <w:tc>
           <w:tcPr>
             <w:tcW w:type="dxa" w:w="1814"/>
@@ -14628,6 +15341,76 @@
                 <w:sz w:val="17"/>
               </w:rPr>
               <w:t>提供站内检索或稍后重试，不生成猜测内容</w:t>
+            </w:r>
+          </w:p>
+        </w:tc>
+      </w:tr>
+      <w:tr>
+        <w:trPr>
+          <w:cantSplit/>
+        </w:trPr>
+        <w:tc>
+          <w:tcPr>
+            <w:tcW w:type="dxa" w:w="3173"/>
+          </w:tcPr>
+          <w:p>
+            <w:r>
+              <w:t>设备不支持实时评分</w:t>
+            </w:r>
+          </w:p>
+        </w:tc>
+        <w:tc>
+          <w:tcPr>
+            <w:tcW w:type="dxa" w:w="3173"/>
+          </w:tcPr>
+          <w:p>
+            <w:r>
+              <w:t>缺少必要音频能力或持续性能不足</w:t>
+            </w:r>
+          </w:p>
+        </w:tc>
+        <w:tc>
+          <w:tcPr>
+            <w:tcW w:type="dxa" w:w="3173"/>
+          </w:tcPr>
+          <w:p>
+            <w:r>
+              <w:t>不启动低质量实时评分，明确提供录音后分析或非评分练习</w:t>
+            </w:r>
+          </w:p>
+        </w:tc>
+      </w:tr>
+      <w:tr>
+        <w:trPr>
+          <w:cantSplit/>
+        </w:trPr>
+        <w:tc>
+          <w:tcPr>
+            <w:tcW w:type="dxa" w:w="3173"/>
+          </w:tcPr>
+          <w:p>
+            <w:r>
+              <w:t>降级分析</w:t>
+            </w:r>
+          </w:p>
+        </w:tc>
+        <w:tc>
+          <w:tcPr>
+            <w:tcW w:type="dxa" w:w="3173"/>
+          </w:tcPr>
+          <w:p>
+            <w:r>
+              <w:t>实时链路不满足门槛但允许采集</w:t>
+            </w:r>
+          </w:p>
+        </w:tc>
+        <w:tc>
+          <w:tcPr>
+            <w:tcW w:type="dxa" w:w="3173"/>
+          </w:tcPr>
+          <w:p>
+            <w:r>
+              <w:t>保留练习上下文，报告标明降级方式、算法版本和有效覆盖率</w:t>
             </w:r>
           </w:p>
         </w:tc>
@@ -14647,6 +15430,15 @@
           <w:rFonts w:ascii="Microsoft YaHei" w:hAnsi="Microsoft YaHei" w:eastAsia="微软雅黑"/>
         </w:rPr>
         <w:t>12.2 发布门槛</w:t>
+      </w:r>
+    </w:p>
+    <w:p>
+      <w:pPr>
+        <w:pStyle w:val="ListBullet"/>
+      </w:pPr>
+      <w:r>
+        <w:rPr/>
+        <w:t>阶段零已输出支持浏览器与内部设备能力矩阵、分乐器测试集、延迟基线和可复现评测报告。</w:t>
       </w:r>
     </w:p>
     <w:p>
@@ -14670,7 +15462,7 @@
         <w:rPr>
           <w:rFonts w:ascii="Microsoft YaHei" w:hAnsi="Microsoft YaHei" w:eastAsia="微软雅黑"/>
         </w:rPr>
-        <w:t>算法评测按乐器和环境拆分，关键指标达到约定目标。</w:t>
+        <w:t>钢琴与小提琴实时单音评分分别完成评测，准确率、有效识别覆盖率、误判率、无法判断率及 P50/P95 延迟达到阶段零冻结的门槛，不以总体平均值替代。</w:t>
       </w:r>
     </w:p>
     <w:p>
@@ -14695,6 +15487,15 @@
           <w:rFonts w:ascii="Microsoft YaHei" w:hAnsi="Microsoft YaHei" w:eastAsia="微软雅黑"/>
         </w:rPr>
         <w:t>监控、告警、灰度、回滚和客服处理流程可用。</w:t>
+      </w:r>
+    </w:p>
+    <w:p>
+      <w:pPr>
+        <w:pStyle w:val="ListBullet"/>
+      </w:pPr>
+      <w:r>
+        <w:rPr/>
+        <w:t>吉他和小号课程可在内容、工具和非实时练习验收通过后发布，不因尚未开放实时评分而阻断；任何新增评分能力须独立灰度并支持算法版本回滚。</w:t>
       </w:r>
     </w:p>
     <w:p>
@@ -14791,6 +15592,7 @@
       <w:tr>
         <w:trPr>
           <w:tblHeader w:val="true"/>
+          <w:cantSplit/>
         </w:trPr>
         <w:tc>
           <w:tcPr>
@@ -14902,6 +15704,9 @@
         </w:tc>
       </w:tr>
       <w:tr>
+        <w:trPr>
+          <w:cantSplit/>
+        </w:trPr>
         <w:tc>
           <w:tcPr>
             <w:tcW w:type="dxa" w:w="1701"/>
@@ -14939,15 +15744,8 @@
             <w:vAlign w:val="center"/>
           </w:tcPr>
           <w:p>
-            <w:pPr>
-              <w:spacing w:after="0" w:line="276" w:lineRule="auto"/>
-            </w:pPr>
-            <w:r>
-              <w:rPr>
-                <w:rFonts w:ascii="Microsoft YaHei" w:hAnsi="Microsoft YaHei" w:eastAsia="微软雅黑"/>
-                <w:sz w:val="17"/>
-              </w:rPr>
-              <w:t>覆盖钢琴、小提琴、吉他和小号</w:t>
+            <w:r>
+              <w:t>四种乐器均覆盖入门课程；首期实时评分仅支持钢琴与小提琴单音</w:t>
             </w:r>
           </w:p>
         </w:tc>
@@ -14963,15 +15761,8 @@
             <w:vAlign w:val="center"/>
           </w:tcPr>
           <w:p>
-            <w:pPr>
-              <w:spacing w:after="0" w:line="276" w:lineRule="auto"/>
-            </w:pPr>
-            <w:r>
-              <w:rPr>
-                <w:rFonts w:ascii="Microsoft YaHei" w:hAnsi="Microsoft YaHei" w:eastAsia="微软雅黑"/>
-                <w:sz w:val="17"/>
-              </w:rPr>
-              <w:t>四种乐器分别配置课程、识别参数和反馈规则</w:t>
+            <w:r>
+              <w:t>课程与评分能力分别配置；吉他和小号先提供工具、非实时练习或录音后分析</w:t>
             </w:r>
           </w:p>
         </w:tc>
@@ -15001,6 +15792,9 @@
         </w:tc>
       </w:tr>
       <w:tr>
+        <w:trPr>
+          <w:cantSplit/>
+        </w:trPr>
         <w:tc>
           <w:tcPr>
             <w:tcW w:type="dxa" w:w="1701"/>
@@ -15104,6 +15898,9 @@
         </w:tc>
       </w:tr>
       <w:tr>
+        <w:trPr>
+          <w:cantSplit/>
+        </w:trPr>
         <w:tc>
           <w:tcPr>
             <w:tcW w:type="dxa" w:w="1701"/>
@@ -15203,6 +16000,9 @@
         </w:tc>
       </w:tr>
       <w:tr>
+        <w:trPr>
+          <w:cantSplit/>
+        </w:trPr>
         <w:tc>
           <w:tcPr>
             <w:tcW w:type="dxa" w:w="1701"/>
@@ -15242,15 +16042,8 @@
             <w:vAlign w:val="center"/>
           </w:tcPr>
           <w:p>
-            <w:pPr>
-              <w:spacing w:after="0" w:line="276" w:lineRule="auto"/>
-            </w:pPr>
-            <w:r>
-              <w:rPr>
-                <w:rFonts w:ascii="Microsoft YaHei" w:hAnsi="Microsoft YaHei" w:eastAsia="微软雅黑"/>
-                <w:sz w:val="17"/>
-              </w:rPr>
-              <w:t>初步设计不单独建立设备分级</w:t>
+            <w:r>
+              <w:t>用户侧不展示设备等级，内部按能力分层</w:t>
             </w:r>
           </w:p>
         </w:tc>
@@ -15267,15 +16060,8 @@
             <w:vAlign w:val="center"/>
           </w:tcPr>
           <w:p>
-            <w:pPr>
-              <w:spacing w:after="0" w:line="276" w:lineRule="auto"/>
-            </w:pPr>
-            <w:r>
-              <w:rPr>
-                <w:rFonts w:ascii="Microsoft YaHei" w:hAnsi="Microsoft YaHei" w:eastAsia="微软雅黑"/>
-                <w:sz w:val="17"/>
-              </w:rPr>
-              <w:t>统一设计，测试阶段只记录明显兼容问题</w:t>
+            <w:r>
+              <w:t>阶段零建立浏览器与设备能力矩阵，用于测试、灰度、降级和问题定位</w:t>
             </w:r>
           </w:p>
         </w:tc>
@@ -15292,20 +16078,16 @@
             <w:vAlign w:val="center"/>
           </w:tcPr>
           <w:p>
-            <w:pPr>
-              <w:spacing w:after="0" w:line="276" w:lineRule="auto"/>
-            </w:pPr>
-            <w:r>
-              <w:rPr>
-                <w:rFonts w:ascii="Microsoft YaHei" w:hAnsi="Microsoft YaHei" w:eastAsia="微软雅黑"/>
-                <w:sz w:val="17"/>
-              </w:rPr>
+            <w:r>
               <w:t>已确认</w:t>
             </w:r>
           </w:p>
         </w:tc>
       </w:tr>
       <w:tr>
+        <w:trPr>
+          <w:cantSplit/>
+        </w:trPr>
         <w:tc>
           <w:tcPr>
             <w:tcW w:type="dxa" w:w="1701"/>
@@ -15405,6 +16187,9 @@
         </w:tc>
       </w:tr>
       <w:tr>
+        <w:trPr>
+          <w:cantSplit/>
+        </w:trPr>
         <w:tc>
           <w:tcPr>
             <w:tcW w:type="dxa" w:w="1701"/>
@@ -15508,6 +16293,9 @@
         </w:tc>
       </w:tr>
       <w:tr>
+        <w:trPr>
+          <w:cantSplit/>
+        </w:trPr>
         <w:tc>
           <w:tcPr>
             <w:tcW w:type="dxa" w:w="1701"/>
@@ -15602,6 +16390,51 @@
                 <w:sz w:val="17"/>
               </w:rPr>
               <w:t>方案已定义</w:t>
+            </w:r>
+          </w:p>
+        </w:tc>
+      </w:tr>
+      <w:tr>
+        <w:trPr>
+          <w:cantSplit/>
+        </w:trPr>
+        <w:tc>
+          <w:tcPr>
+            <w:tcW w:type="dxa" w:w="2379"/>
+          </w:tcPr>
+          <w:p>
+            <w:r>
+              <w:t>算法目标值</w:t>
+            </w:r>
+          </w:p>
+        </w:tc>
+        <w:tc>
+          <w:tcPr>
+            <w:tcW w:type="dxa" w:w="2379"/>
+          </w:tcPr>
+          <w:p>
+            <w:r>
+              <w:t>150ms 与 95% 为受控条件下的阶段零目标</w:t>
+            </w:r>
+          </w:p>
+        </w:tc>
+        <w:tc>
+          <w:tcPr>
+            <w:tcW w:type="dxa" w:w="2379"/>
+          </w:tcPr>
+          <w:p>
+            <w:r>
+              <w:t>PoC 后按乐器、设备能力和环境冻结正式门槛，同时报告覆盖率、误判率和无法判断率</w:t>
+            </w:r>
+          </w:p>
+        </w:tc>
+        <w:tc>
+          <w:tcPr>
+            <w:tcW w:type="dxa" w:w="2379"/>
+          </w:tcPr>
+          <w:p>
+            <w:r>
+              <w:t>待技术验证</w:t>
             </w:r>
           </w:p>
         </w:tc>
@@ -15645,6 +16478,7 @@
       <w:tr>
         <w:trPr>
           <w:tblHeader w:val="true"/>
+          <w:cantSplit/>
         </w:trPr>
         <w:tc>
           <w:tcPr>
@@ -15702,6 +16536,9 @@
         </w:tc>
       </w:tr>
       <w:tr>
+        <w:trPr>
+          <w:cantSplit/>
+        </w:trPr>
         <w:tc>
           <w:tcPr>
             <w:tcW w:type="dxa" w:w="2268"/>
@@ -15753,6 +16590,9 @@
         </w:tc>
       </w:tr>
       <w:tr>
+        <w:trPr>
+          <w:cantSplit/>
+        </w:trPr>
         <w:tc>
           <w:tcPr>
             <w:tcW w:type="dxa" w:w="2268"/>
@@ -15806,6 +16646,9 @@
         </w:tc>
       </w:tr>
       <w:tr>
+        <w:trPr>
+          <w:cantSplit/>
+        </w:trPr>
         <w:tc>
           <w:tcPr>
             <w:tcW w:type="dxa" w:w="2268"/>
@@ -15857,6 +16700,9 @@
         </w:tc>
       </w:tr>
       <w:tr>
+        <w:trPr>
+          <w:cantSplit/>
+        </w:trPr>
         <w:tc>
           <w:tcPr>
             <w:tcW w:type="dxa" w:w="2268"/>

</xml_diff>